<commit_message>
docs: rescope Subteam 2 charter for Alternative B dual-prototype model and update defense guide
</commit_message>
<xml_diff>
--- a/docs/Project_Charter_Subteam_2.docx
+++ b/docs/Project_Charter_Subteam_2.docx
@@ -32,17 +32,7 @@
         <w:jc w:val="center"/>
       </w:pPr>
       <w:r>
-        <w:rPr>
-          <w:rFonts w:ascii="Arial" w:hAnsi="Arial" w:eastAsia="Arial" w:cs="Arial"/>
-          <w:b w:val="0"/>
-          <w:bCs w:val="0"/>
-          <w:i/>
-          <w:iCs/>
-          <w:color w:val="2E75B6"/>
-          <w:sz w:val="22"/>
-          <w:szCs w:val="22"/>
-        </w:rPr>
-        <w:t xml:space="preserve">  ·  Version 1.0  ·  Third Wave Inc.</w:t>
+        <w:t xml:space="preserve">  ·  Version 1.1  ·  Third Wave Inc.</w:t>
       </w:r>
     </w:p>
     <w:p>
@@ -176,17 +166,8 @@
             </w:tcMar>
           </w:tcPr>
           <w:p>
-            <w:pPr>
-              <w:spacing w:before="0" w:after="0" w:line="240" w:lineRule="auto"/>
-            </w:pPr>
-            <w:r>
-              <w:rPr>
-                <w:rFonts w:ascii="Arial" w:hAnsi="Arial"/>
-                <w:b w:val="0"/>
-                <w:i w:val="0"/>
-                <w:sz w:val="17"/>
-              </w:rPr>
-              <w:t>Ontokb-E Enterprise Platform Transformation – Subteam 2</w:t>
+            <w:r>
+              <w:t>Ontokb-E Enterprise Platform Transformation – Subteam 2 (Alternative B: Action-Centric Architecture)</w:t>
             </w:r>
           </w:p>
         </w:tc>
@@ -259,16 +240,7 @@
             </w:tcMar>
           </w:tcPr>
           <w:p>
-            <w:pPr>
-              <w:spacing w:before="0" w:after="0" w:line="240" w:lineRule="auto"/>
-            </w:pPr>
-            <w:r>
-              <w:rPr>
-                <w:rFonts w:ascii="Arial" w:hAnsi="Arial"/>
-                <w:b w:val="0"/>
-                <w:i w:val="0"/>
-                <w:sz w:val="17"/>
-              </w:rPr>
+            <w:r>
               <w:t>Zhang Dapeng — Third Wave Inc.</w:t>
             </w:r>
           </w:p>
@@ -342,16 +314,7 @@
             </w:tcMar>
           </w:tcPr>
           <w:p>
-            <w:pPr>
-              <w:spacing w:before="0" w:after="0" w:line="240" w:lineRule="auto"/>
-            </w:pPr>
-            <w:r>
-              <w:rPr>
-                <w:rFonts w:ascii="Arial" w:hAnsi="Arial"/>
-                <w:b w:val="0"/>
-                <w:i w:val="0"/>
-                <w:sz w:val="17"/>
-              </w:rPr>
+            <w:r>
               <w:t>Pooja — Third Wave Inc.</w:t>
             </w:r>
           </w:p>
@@ -425,16 +388,7 @@
             </w:tcMar>
           </w:tcPr>
           <w:p>
-            <w:pPr>
-              <w:spacing w:before="0" w:after="0" w:line="240" w:lineRule="auto"/>
-            </w:pPr>
-            <w:r>
-              <w:rPr>
-                <w:rFonts w:ascii="Arial" w:hAnsi="Arial"/>
-                <w:b w:val="0"/>
-                <w:i w:val="0"/>
-                <w:sz w:val="17"/>
-              </w:rPr>
+            <w:r>
               <w:t>______________________ — Third Wave Inc.</w:t>
             </w:r>
           </w:p>
@@ -508,16 +462,7 @@
             </w:tcMar>
           </w:tcPr>
           <w:p>
-            <w:pPr>
-              <w:spacing w:before="0" w:after="0" w:line="240" w:lineRule="auto"/>
-            </w:pPr>
-            <w:r>
-              <w:rPr>
-                <w:rFonts w:ascii="Arial" w:hAnsi="Arial"/>
-                <w:b w:val="0"/>
-                <w:i w:val="0"/>
-                <w:sz w:val="17"/>
-              </w:rPr>
+            <w:r>
               <w:t>TW-ONT-2026-002</w:t>
             </w:r>
           </w:p>
@@ -591,17 +536,8 @@
             </w:tcMar>
           </w:tcPr>
           <w:p>
-            <w:pPr>
-              <w:spacing w:before="0" w:after="0" w:line="240" w:lineRule="auto"/>
-            </w:pPr>
-            <w:r>
-              <w:rPr>
-                <w:rFonts w:ascii="Arial" w:hAnsi="Arial"/>
-                <w:b w:val="0"/>
-                <w:i w:val="0"/>
-                <w:sz w:val="17"/>
-              </w:rPr>
-              <w:t>1.0</w:t>
+            <w:r>
+              <w:t>1.1</w:t>
             </w:r>
           </w:p>
         </w:tc>
@@ -674,16 +610,7 @@
             </w:tcMar>
           </w:tcPr>
           <w:p>
-            <w:pPr>
-              <w:spacing w:before="0" w:after="0" w:line="240" w:lineRule="auto"/>
-            </w:pPr>
-            <w:r>
-              <w:rPr>
-                <w:rFonts w:ascii="Arial" w:hAnsi="Arial"/>
-                <w:b w:val="0"/>
-                <w:i w:val="0"/>
-                <w:sz w:val="17"/>
-              </w:rPr>
+            <w:r>
               <w:t>2026-10-14</w:t>
             </w:r>
           </w:p>
@@ -757,17 +684,8 @@
             </w:tcMar>
           </w:tcPr>
           <w:p>
-            <w:pPr>
-              <w:spacing w:before="0" w:after="0" w:line="240" w:lineRule="auto"/>
-            </w:pPr>
-            <w:r>
-              <w:rPr>
-                <w:rFonts w:ascii="Arial" w:hAnsi="Arial"/>
-                <w:b w:val="0"/>
-                <w:i w:val="0"/>
-                <w:sz w:val="17"/>
-              </w:rPr>
-              <w:t>2026-10-14</w:t>
+            <w:r>
+              <w:t>2026-10-15</w:t>
             </w:r>
           </w:p>
         </w:tc>
@@ -840,17 +758,8 @@
             </w:tcMar>
           </w:tcPr>
           <w:p>
-            <w:pPr>
-              <w:spacing w:before="0" w:after="0" w:line="240" w:lineRule="auto"/>
-            </w:pPr>
-            <w:r>
-              <w:rPr>
-                <w:rFonts w:ascii="Arial" w:hAnsi="Arial"/>
-                <w:b w:val="0"/>
-                <w:i w:val="0"/>
-                <w:sz w:val="17"/>
-              </w:rPr>
-              <w:t>Proposal (Under Review)</w:t>
+            <w:r>
+              <w:t>Proposal (Under Review – Rescoped for Comparative Evaluation)</w:t>
             </w:r>
           </w:p>
         </w:tc>
@@ -1095,16 +1004,7 @@
             <w:vAlign w:val="center"/>
           </w:tcPr>
           <w:p>
-            <w:pPr>
-              <w:spacing w:before="0" w:after="0" w:line="240" w:lineRule="auto"/>
-            </w:pPr>
-            <w:r>
-              <w:rPr>
-                <w:rFonts w:ascii="Arial" w:hAnsi="Arial"/>
-                <w:b w:val="0"/>
-                <w:i w:val="0"/>
-                <w:sz w:val="18"/>
-              </w:rPr>
+            <w:r>
               <w:t>1.0</w:t>
             </w:r>
           </w:p>
@@ -1128,16 +1028,7 @@
             <w:vAlign w:val="center"/>
           </w:tcPr>
           <w:p>
-            <w:pPr>
-              <w:spacing w:before="0" w:after="0" w:line="240" w:lineRule="auto"/>
-            </w:pPr>
-            <w:r>
-              <w:rPr>
-                <w:rFonts w:ascii="Arial" w:hAnsi="Arial"/>
-                <w:b w:val="0"/>
-                <w:i w:val="0"/>
-                <w:sz w:val="18"/>
-              </w:rPr>
+            <w:r>
               <w:t>2026-10-14</w:t>
             </w:r>
           </w:p>
@@ -1161,16 +1052,7 @@
             <w:vAlign w:val="center"/>
           </w:tcPr>
           <w:p>
-            <w:pPr>
-              <w:spacing w:before="0" w:after="0" w:line="240" w:lineRule="auto"/>
-            </w:pPr>
-            <w:r>
-              <w:rPr>
-                <w:rFonts w:ascii="Arial" w:hAnsi="Arial"/>
-                <w:b w:val="0"/>
-                <w:i w:val="0"/>
-                <w:sz w:val="18"/>
-              </w:rPr>
+            <w:r>
               <w:t>Project Team (Subteam 2)</w:t>
             </w:r>
           </w:p>
@@ -1194,17 +1076,8 @@
             <w:vAlign w:val="center"/>
           </w:tcPr>
           <w:p>
-            <w:pPr>
-              <w:spacing w:before="0" w:after="0" w:line="240" w:lineRule="auto"/>
-            </w:pPr>
-            <w:r>
-              <w:rPr>
-                <w:rFonts w:ascii="Arial" w:hAnsi="Arial"/>
-                <w:b w:val="0"/>
-                <w:i w:val="0"/>
-                <w:sz w:val="18"/>
-              </w:rPr>
-              <w:t>Initial project proposal</w:t>
+            <w:r>
+              <w:t>Initial project charter proposal</w:t>
             </w:r>
           </w:p>
         </w:tc>
@@ -1245,9 +1118,9 @@
             <w:vAlign w:val="center"/>
           </w:tcPr>
           <w:p>
-            <w:pPr>
-              <w:spacing w:before="0" w:after="0" w:line="240" w:lineRule="auto"/>
-            </w:pPr>
+            <w:r>
+              <w:t>1.1</w:t>
+            </w:r>
           </w:p>
         </w:tc>
         <w:tc>
@@ -1269,9 +1142,9 @@
             <w:vAlign w:val="center"/>
           </w:tcPr>
           <w:p>
-            <w:pPr>
-              <w:spacing w:before="0" w:after="0" w:line="240" w:lineRule="auto"/>
-            </w:pPr>
+            <w:r>
+              <w:t>2026-10-15</w:t>
+            </w:r>
           </w:p>
         </w:tc>
         <w:tc>
@@ -1293,9 +1166,9 @@
             <w:vAlign w:val="center"/>
           </w:tcPr>
           <w:p>
-            <w:pPr>
-              <w:spacing w:before="0" w:after="0" w:line="240" w:lineRule="auto"/>
-            </w:pPr>
+            <w:r>
+              <w:t>Project Team (Subteam 2)</w:t>
+            </w:r>
           </w:p>
         </w:tc>
         <w:tc>
@@ -1317,9 +1190,9 @@
             <w:vAlign w:val="center"/>
           </w:tcPr>
           <w:p>
-            <w:pPr>
-              <w:spacing w:before="0" w:after="0" w:line="240" w:lineRule="auto"/>
-            </w:pPr>
+            <w:r>
+              <w:t>Rescoped for Alternative B (Action Runtime architecture) &amp; dual-prototype evaluation</w:t>
+            </w:r>
           </w:p>
         </w:tc>
       </w:tr>
@@ -1350,104 +1223,6 @@
         <w:t>1.  Project Overview</w:t>
       </w:r>
     </w:p>
-    <w:tbl>
-      <w:tblPr>
-        <w:tblStyle w:val="9"/>
-        <w:tblW w:w="9026" w:type="dxa"/>
-        <w:tblInd w:w="0" w:type="dxa"/>
-        <w:tblBorders>
-          <w:top w:val="single" w:color="auto" w:sz="4" w:space="0"/>
-          <w:left w:val="single" w:color="auto" w:sz="4" w:space="0"/>
-          <w:bottom w:val="single" w:color="auto" w:sz="4" w:space="0"/>
-          <w:right w:val="single" w:color="auto" w:sz="4" w:space="0"/>
-          <w:insideH w:val="single" w:color="auto" w:sz="4" w:space="0"/>
-          <w:insideV w:val="single" w:color="auto" w:sz="4" w:space="0"/>
-        </w:tblBorders>
-        <w:tblLayout w:type="autofit"/>
-        <w:tblCellMar>
-          <w:top w:w="0" w:type="dxa"/>
-          <w:left w:w="10" w:type="dxa"/>
-          <w:bottom w:w="0" w:type="dxa"/>
-          <w:right w:w="10" w:type="dxa"/>
-        </w:tblCellMar>
-      </w:tblPr>
-      <w:tblGrid>
-        <w:gridCol w:w="9026"/>
-      </w:tblGrid>
-      <w:tr>
-        <w:tblPrEx>
-          <w:tblBorders>
-            <w:top w:val="single" w:color="auto" w:sz="4" w:space="0"/>
-            <w:left w:val="single" w:color="auto" w:sz="4" w:space="0"/>
-            <w:bottom w:val="single" w:color="auto" w:sz="4" w:space="0"/>
-            <w:right w:val="single" w:color="auto" w:sz="4" w:space="0"/>
-            <w:insideH w:val="single" w:color="auto" w:sz="4" w:space="0"/>
-            <w:insideV w:val="single" w:color="auto" w:sz="4" w:space="0"/>
-          </w:tblBorders>
-          <w:tblCellMar>
-            <w:top w:w="0" w:type="dxa"/>
-            <w:left w:w="10" w:type="dxa"/>
-            <w:bottom w:w="0" w:type="dxa"/>
-            <w:right w:w="10" w:type="dxa"/>
-          </w:tblCellMar>
-        </w:tblPrEx>
-        <w:tc>
-          <w:tcPr>
-            <w:tcBorders>
-              <w:top w:val="single" w:color="B5C4DE" w:sz="4" w:space="0"/>
-              <w:left w:val="single" w:color="B5C4DE" w:sz="4" w:space="0"/>
-              <w:bottom w:val="single" w:color="B5C4DE" w:sz="4" w:space="0"/>
-              <w:right w:val="single" w:color="B5C4DE" w:sz="4" w:space="0"/>
-            </w:tcBorders>
-            <w:shd w:val="clear" w:color="auto" w:fill="EBF3FB"/>
-            <w:tcMar>
-              <w:top w:w="80" w:type="dxa"/>
-              <w:left w:w="140" w:type="dxa"/>
-              <w:bottom w:w="80" w:type="dxa"/>
-              <w:right w:w="140" w:type="dxa"/>
-            </w:tcMar>
-          </w:tcPr>
-          <w:p>
-            <w:pPr>
-              <w:spacing w:before="0" w:after="40"/>
-              <w:jc w:val="left"/>
-            </w:pPr>
-            <w:r>
-              <w:rPr>
-                <w:rFonts w:ascii="Arial" w:hAnsi="Arial" w:eastAsia="Arial" w:cs="Arial"/>
-                <w:b/>
-                <w:bCs/>
-                <w:i w:val="0"/>
-                <w:iCs w:val="0"/>
-                <w:color w:val="2E75B6"/>
-                <w:sz w:val="18"/>
-                <w:szCs w:val="18"/>
-              </w:rPr>
-              <w:t>Guide</w:t>
-            </w:r>
-          </w:p>
-          <w:p>
-            <w:pPr>
-              <w:spacing w:before="0" w:after="80"/>
-              <w:jc w:val="left"/>
-            </w:pPr>
-            <w:r>
-              <w:rPr>
-                <w:rFonts w:ascii="Arial" w:hAnsi="Arial" w:eastAsia="Arial" w:cs="Arial"/>
-                <w:b w:val="0"/>
-                <w:bCs w:val="0"/>
-                <w:i w:val="0"/>
-                <w:iCs w:val="0"/>
-                <w:color w:val="595959"/>
-                <w:sz w:val="17"/>
-                <w:szCs w:val="17"/>
-              </w:rPr>
-              <w:t>What is this project about? Keep this short — 2 to 3 sentences. Answer: what will be built, who benefits, and what problem does it solve? Avoid technical jargon.</w:t>
-            </w:r>
-          </w:p>
-        </w:tc>
-      </w:tr>
-    </w:tbl>
     <w:p>
       <w:pPr>
         <w:spacing w:before="80" w:after="0"/>
@@ -1547,16 +1322,15 @@
           </w:tcPr>
           <w:p>
             <w:pPr>
-              <w:spacing w:before="0" w:after="0" w:line="240" w:lineRule="auto"/>
-            </w:pPr>
-            <w:r>
-              <w:rPr>
-                <w:rFonts w:ascii="Arial" w:hAnsi="Arial"/>
-                <w:b w:val="0"/>
-                <w:i w:val="0"/>
-                <w:sz w:val="17"/>
-              </w:rPr>
-              <w:t>Transform LOGOS/OntoKb from a single-purpose customer-support reply assistant into a domain-neutral enterprise platform, so that any business domain can be onboarded through configuration, with enterprise-grade security, governance and scalability.</w:t>
+              <w:spacing w:line="276" w:lineRule="auto"/>
+            </w:pPr>
+            <w:r/>
+            <w:r>
+              <w:rPr>
+                <w:rFonts w:ascii="Calibri" w:hAnsi="Calibri"/>
+                <w:sz w:val="20"/>
+              </w:rPr>
+              <w:t>Develop and evaluate an independent architectural alternative (Alternative B: Action-Centric Knowledge Runtime &amp; Epistemic Memory Layer) for the Ontokb-E platform transformation, executed in parallel with Subteam 1 (Alternative A) under an exploratory dual-prototype model. The project aims to determine the most practical, resilient, and useful architecture for onboarding multi-domain enterprise knowledge under strict infrastructure constraints.</w:t>
             </w:r>
           </w:p>
         </w:tc>
@@ -1630,16 +1404,15 @@
           </w:tcPr>
           <w:p>
             <w:pPr>
-              <w:spacing w:before="0" w:after="0" w:line="240" w:lineRule="auto"/>
-            </w:pPr>
-            <w:r>
-              <w:rPr>
-                <w:rFonts w:ascii="Arial" w:hAnsi="Arial"/>
-                <w:b w:val="0"/>
-                <w:i w:val="0"/>
-                <w:sz w:val="17"/>
-              </w:rPr>
-              <w:t>LOGOS was originally built for one use case: drafting Dospara customer-support replies. Its business rules are embedded in the core services, its data model (ontology) is not enforced at runtime, and key enterprise capabilities such as multi-tenancy, enforced authentication, separation of duties, tamper-evident audit and horizontal scaling are not yet in place. These limitations prevent the platform from being used in other business domains.</w:t>
+              <w:spacing w:line="276" w:lineRule="auto"/>
+            </w:pPr>
+            <w:r/>
+            <w:r>
+              <w:rPr>
+                <w:rFonts w:ascii="Calibri" w:hAnsi="Calibri"/>
+                <w:sz w:val="20"/>
+              </w:rPr>
+              <w:t>LOGOS was originally developed as a single-purpose assistant for Dospara customer-support drafting with hardcoded business logic and no runtime ontology enforcement. To achieve an enterprise-grade transformation within an 80 person-hour allocation, Third Wave is testing two distinct alternatives: Subteam 1 explores an interface-led/workbench transformation (Alternative A), while Subteam 2 explores a decoupled, action-centric runtime with non-invasive epistemic memory (Alternative B) to evaluate which approach delivers superior enterprise utility, lower integration complexity, and deterministic domain execution.</w:t>
             </w:r>
           </w:p>
         </w:tc>
@@ -1713,16 +1486,21 @@
           </w:tcPr>
           <w:p>
             <w:pPr>
-              <w:spacing w:before="0" w:after="0" w:line="240" w:lineRule="auto"/>
-            </w:pPr>
-            <w:r>
-              <w:rPr>
-                <w:rFonts w:ascii="Arial" w:hAnsi="Arial"/>
-                <w:b w:val="0"/>
-                <w:i w:val="0"/>
-                <w:sz w:val="17"/>
-              </w:rPr>
-              <w:t>New business domains onboarded through configuration, without changes to core services. Related documents linked automatically, even when they are received weeks apart. All services authenticated; every business action checked against policy and audited. Multiple instances per service, with verified data isolation between tenants.</w:t>
+              <w:spacing w:line="276" w:lineRule="auto"/>
+            </w:pPr>
+            <w:r/>
+            <w:r>
+              <w:rPr>
+                <w:rFonts w:ascii="Calibri" w:hAnsi="Calibri"/>
+                <w:sz w:val="20"/>
+              </w:rPr>
+              <w:t>1. Configurable Multi-Domain Onboarding: New business domains onboarded via declarative configuration without core service code alterations.</w:t>
+              <w:br/>
+              <w:t>2. Non-Invasive State &amp; Audit Tracking: Verified tenant data isolation and tamper-evident audit logging implemented at the application layer without modifying existing PostgreSQL schemas.</w:t>
+              <w:br/>
+              <w:t>3. Cross-Document Linking: Automated entity and relationship extraction across chronologically spaced documents.</w:t>
+              <w:br/>
+              <w:t>4. Comparative Evaluation Findings: Empirical data comparing Alternative A vs Alternative B to inform Third Wave's long-term enterprise platform roadmap.</w:t>
             </w:r>
           </w:p>
         </w:tc>
@@ -1795,17 +1573,8 @@
             </w:tcMar>
           </w:tcPr>
           <w:p>
-            <w:pPr>
-              <w:spacing w:before="0" w:after="0" w:line="240" w:lineRule="auto"/>
-            </w:pPr>
-            <w:r>
-              <w:rPr>
-                <w:rFonts w:ascii="Arial" w:hAnsi="Arial"/>
-                <w:b w:val="0"/>
-                <w:i w:val="0"/>
-                <w:sz w:val="17"/>
-              </w:rPr>
-              <w:t>Enhancement (re-architecture of the existing LOGOS/OntoKb platform)</w:t>
+            <w:r>
+              <w:t>Enhancement / Comparative Architecture Prototype (Subteam 2 Alternative B)</w:t>
             </w:r>
           </w:p>
         </w:tc>
@@ -1837,104 +1606,6 @@
         <w:t>2.  Scope</w:t>
       </w:r>
     </w:p>
-    <w:tbl>
-      <w:tblPr>
-        <w:tblStyle w:val="9"/>
-        <w:tblW w:w="9026" w:type="dxa"/>
-        <w:tblInd w:w="0" w:type="dxa"/>
-        <w:tblBorders>
-          <w:top w:val="single" w:color="auto" w:sz="4" w:space="0"/>
-          <w:left w:val="single" w:color="auto" w:sz="4" w:space="0"/>
-          <w:bottom w:val="single" w:color="auto" w:sz="4" w:space="0"/>
-          <w:right w:val="single" w:color="auto" w:sz="4" w:space="0"/>
-          <w:insideH w:val="single" w:color="auto" w:sz="4" w:space="0"/>
-          <w:insideV w:val="single" w:color="auto" w:sz="4" w:space="0"/>
-        </w:tblBorders>
-        <w:tblLayout w:type="autofit"/>
-        <w:tblCellMar>
-          <w:top w:w="0" w:type="dxa"/>
-          <w:left w:w="10" w:type="dxa"/>
-          <w:bottom w:w="0" w:type="dxa"/>
-          <w:right w:w="10" w:type="dxa"/>
-        </w:tblCellMar>
-      </w:tblPr>
-      <w:tblGrid>
-        <w:gridCol w:w="9026"/>
-      </w:tblGrid>
-      <w:tr>
-        <w:tblPrEx>
-          <w:tblBorders>
-            <w:top w:val="single" w:color="auto" w:sz="4" w:space="0"/>
-            <w:left w:val="single" w:color="auto" w:sz="4" w:space="0"/>
-            <w:bottom w:val="single" w:color="auto" w:sz="4" w:space="0"/>
-            <w:right w:val="single" w:color="auto" w:sz="4" w:space="0"/>
-            <w:insideH w:val="single" w:color="auto" w:sz="4" w:space="0"/>
-            <w:insideV w:val="single" w:color="auto" w:sz="4" w:space="0"/>
-          </w:tblBorders>
-          <w:tblCellMar>
-            <w:top w:w="0" w:type="dxa"/>
-            <w:left w:w="10" w:type="dxa"/>
-            <w:bottom w:w="0" w:type="dxa"/>
-            <w:right w:w="10" w:type="dxa"/>
-          </w:tblCellMar>
-        </w:tblPrEx>
-        <w:tc>
-          <w:tcPr>
-            <w:tcBorders>
-              <w:top w:val="single" w:color="B5C4DE" w:sz="4" w:space="0"/>
-              <w:left w:val="single" w:color="B5C4DE" w:sz="4" w:space="0"/>
-              <w:bottom w:val="single" w:color="B5C4DE" w:sz="4" w:space="0"/>
-              <w:right w:val="single" w:color="B5C4DE" w:sz="4" w:space="0"/>
-            </w:tcBorders>
-            <w:shd w:val="clear" w:color="auto" w:fill="EBF3FB"/>
-            <w:tcMar>
-              <w:top w:w="80" w:type="dxa"/>
-              <w:left w:w="140" w:type="dxa"/>
-              <w:bottom w:w="80" w:type="dxa"/>
-              <w:right w:w="140" w:type="dxa"/>
-            </w:tcMar>
-          </w:tcPr>
-          <w:p>
-            <w:pPr>
-              <w:spacing w:before="0" w:after="40"/>
-              <w:jc w:val="left"/>
-            </w:pPr>
-            <w:r>
-              <w:rPr>
-                <w:rFonts w:ascii="Arial" w:hAnsi="Arial" w:eastAsia="Arial" w:cs="Arial"/>
-                <w:b/>
-                <w:bCs/>
-                <w:i w:val="0"/>
-                <w:iCs w:val="0"/>
-                <w:color w:val="2E75B6"/>
-                <w:sz w:val="18"/>
-                <w:szCs w:val="18"/>
-              </w:rPr>
-              <w:t>Guide</w:t>
-            </w:r>
-          </w:p>
-          <w:p>
-            <w:pPr>
-              <w:spacing w:before="0" w:after="80"/>
-              <w:jc w:val="left"/>
-            </w:pPr>
-            <w:r>
-              <w:rPr>
-                <w:rFonts w:ascii="Arial" w:hAnsi="Arial" w:eastAsia="Arial" w:cs="Arial"/>
-                <w:b w:val="0"/>
-                <w:bCs w:val="0"/>
-                <w:i w:val="0"/>
-                <w:iCs w:val="0"/>
-                <w:color w:val="595959"/>
-                <w:sz w:val="17"/>
-                <w:szCs w:val="17"/>
-              </w:rPr>
-              <w:t>Clearly state what IS and IS NOT included in this project. Being explicit about what is out of scope prevents disputes later.</w:t>
-            </w:r>
-          </w:p>
-        </w:tc>
-      </w:tr>
-    </w:tbl>
     <w:p>
       <w:pPr>
         <w:spacing w:before="80" w:after="0"/>
@@ -2033,17 +1704,158 @@
             </w:tcMar>
           </w:tcPr>
           <w:p>
-            <w:pPr>
-              <w:spacing w:before="0" w:after="0" w:line="240" w:lineRule="auto"/>
-            </w:pPr>
-            <w:r>
-              <w:rPr>
-                <w:rFonts w:ascii="Arial" w:hAnsi="Arial"/>
-                <w:b w:val="0"/>
-                <w:i w:val="0"/>
-                <w:sz w:val="17"/>
-              </w:rPr>
-              <w:t>Enterprise ontology redesign: shared core data model with versioning, enforced object lifecycles (state machines) and time-aware actions (validity windows, deadlines, approval expiry). Domain-neutral platform: customer-support and meeting-specific modules replaced by configurable domain packs. Cross-document relationship detection: automatic linking of related documents received at different times, with timelines and change tracking. Knowledge and retrieval layer redesigned to serve any content type under release control. Workflow orchestration, data pipeline and runtime performance improvements. Agent and model layer: provider-independent model gateway, prompt management and AI safety controls. Control plane and Workbench redesign with single sign-on and role-based access. Enterprise security and governance: authentication on all services, multi-tenancy, separation of duties, tamper-evident audit and data protection. Operational readiness: horizontally scalable services, monitoring, CI/CD and automated testing.</w:t>
+            <w:r>
+              <w:rPr>
+                <w:rFonts w:ascii="Calibri" w:hAnsi="Calibri"/>
+                <w:b/>
+                <w:sz w:val="20"/>
+              </w:rPr>
+              <w:t>The mandatory prototype scope is strictly bounded to the core Alternative B runtime architecture:</w:t>
+            </w:r>
+          </w:p>
+          <w:p>
+            <w:pPr>
+              <w:spacing w:after="40" w:before="20" w:line="276" w:lineRule="auto"/>
+              <w:ind w:left="216"/>
+            </w:pPr>
+            <w:r>
+              <w:rPr>
+                <w:rFonts w:ascii="Calibri" w:hAnsi="Calibri"/>
+                <w:b/>
+                <w:sz w:val="20"/>
+              </w:rPr>
+              <w:t xml:space="preserve">• </w:t>
+            </w:r>
+            <w:r>
+              <w:rPr>
+                <w:rFonts w:ascii="Calibri" w:hAnsi="Calibri"/>
+                <w:b/>
+                <w:sz w:val="20"/>
+              </w:rPr>
+              <w:t xml:space="preserve">Action-Centric Ontology Runtime: </w:t>
+            </w:r>
+            <w:r>
+              <w:rPr>
+                <w:rFonts w:ascii="Calibri" w:hAnsi="Calibri"/>
+                <w:sz w:val="20"/>
+              </w:rPr>
+              <w:t>Shared core data model enforcing formal state transitions, action preconditions, and entity lifecycles.</w:t>
+            </w:r>
+          </w:p>
+          <w:p>
+            <w:pPr>
+              <w:spacing w:after="40" w:before="20" w:line="276" w:lineRule="auto"/>
+              <w:ind w:left="216"/>
+            </w:pPr>
+            <w:r>
+              <w:rPr>
+                <w:rFonts w:ascii="Calibri" w:hAnsi="Calibri"/>
+                <w:b/>
+                <w:sz w:val="20"/>
+              </w:rPr>
+              <w:t xml:space="preserve">• </w:t>
+            </w:r>
+            <w:r>
+              <w:rPr>
+                <w:rFonts w:ascii="Calibri" w:hAnsi="Calibri"/>
+                <w:b/>
+                <w:sz w:val="20"/>
+              </w:rPr>
+              <w:t xml:space="preserve">Epistemic Memory &amp; Audit Sourcing: </w:t>
+            </w:r>
+            <w:r>
+              <w:rPr>
+                <w:rFonts w:ascii="Calibri" w:hAnsi="Calibri"/>
+                <w:sz w:val="20"/>
+              </w:rPr>
+              <w:t>Application-level event logging and JSON-LD object layer providing tamper-evident audit and tenant data isolation without modifying database schemas.</w:t>
+            </w:r>
+          </w:p>
+          <w:p>
+            <w:pPr>
+              <w:spacing w:after="40" w:before="20" w:line="276" w:lineRule="auto"/>
+              <w:ind w:left="216"/>
+            </w:pPr>
+            <w:r>
+              <w:rPr>
+                <w:rFonts w:ascii="Calibri" w:hAnsi="Calibri"/>
+                <w:b/>
+                <w:sz w:val="20"/>
+              </w:rPr>
+              <w:t xml:space="preserve">• </w:t>
+            </w:r>
+            <w:r>
+              <w:rPr>
+                <w:rFonts w:ascii="Calibri" w:hAnsi="Calibri"/>
+                <w:b/>
+                <w:sz w:val="20"/>
+              </w:rPr>
+              <w:t xml:space="preserve">Domain-Neutral Ingestion &amp; Configuration: </w:t>
+            </w:r>
+            <w:r>
+              <w:rPr>
+                <w:rFonts w:ascii="Calibri" w:hAnsi="Calibri"/>
+                <w:sz w:val="20"/>
+              </w:rPr>
+              <w:t>Declarative domain pack loader replacing hardcoded customer-support rules with reusable domain schemas.</w:t>
+            </w:r>
+          </w:p>
+          <w:p>
+            <w:pPr>
+              <w:spacing w:after="40" w:before="20" w:line="276" w:lineRule="auto"/>
+              <w:ind w:left="216"/>
+            </w:pPr>
+            <w:r>
+              <w:rPr>
+                <w:rFonts w:ascii="Calibri" w:hAnsi="Calibri"/>
+                <w:b/>
+                <w:sz w:val="20"/>
+              </w:rPr>
+              <w:t xml:space="preserve">• </w:t>
+            </w:r>
+            <w:r>
+              <w:rPr>
+                <w:rFonts w:ascii="Calibri" w:hAnsi="Calibri"/>
+                <w:b/>
+                <w:sz w:val="20"/>
+              </w:rPr>
+              <w:t xml:space="preserve">Cross-Document Relationship Retrieval: </w:t>
+            </w:r>
+            <w:r>
+              <w:rPr>
+                <w:rFonts w:ascii="Calibri" w:hAnsi="Calibri"/>
+                <w:sz w:val="20"/>
+              </w:rPr>
+              <w:t>Hybrid semantic and graph retrieval to link related entities across documents received weeks apart.</w:t>
+            </w:r>
+          </w:p>
+          <w:p>
+            <w:pPr>
+              <w:spacing w:after="40" w:before="20" w:line="276" w:lineRule="auto"/>
+              <w:ind w:left="216"/>
+            </w:pPr>
+            <w:r>
+              <w:rPr>
+                <w:rFonts w:ascii="Calibri" w:hAnsi="Calibri"/>
+                <w:b/>
+                <w:sz w:val="20"/>
+              </w:rPr>
+              <w:t xml:space="preserve">• </w:t>
+            </w:r>
+            <w:r>
+              <w:rPr>
+                <w:rFonts w:ascii="Calibri" w:hAnsi="Calibri"/>
+                <w:b/>
+                <w:sz w:val="20"/>
+              </w:rPr>
+              <w:t xml:space="preserve">API Integration &amp; Evaluation Layer: </w:t>
+            </w:r>
+            <w:r>
+              <w:rPr>
+                <w:rFonts w:ascii="Calibri" w:hAnsi="Calibri"/>
+                <w:sz w:val="20"/>
+              </w:rPr>
+              <w:t>REST endpoints exposing ontology queries, action execution, and hooks for standardized benchmark evaluation.</w:t>
             </w:r>
           </w:p>
         </w:tc>
@@ -2116,17 +1928,158 @@
             </w:tcMar>
           </w:tcPr>
           <w:p>
-            <w:pPr>
-              <w:spacing w:before="0" w:after="0" w:line="240" w:lineRule="auto"/>
-            </w:pPr>
-            <w:r>
-              <w:rPr>
-                <w:rFonts w:ascii="Arial" w:hAnsi="Arial"/>
-                <w:b w:val="0"/>
-                <w:i w:val="0"/>
-                <w:sz w:val="17"/>
-              </w:rPr>
-              <w:t>Changes to the PostgreSQL database (schemas, tables, indexes or version). Usage metering, billing and formal compliance certification (planned for a later phase). Migration of historical customer-support data. Mobile applications and rollout to external customer environments.</w:t>
+            <w:r>
+              <w:rPr>
+                <w:rFonts w:ascii="Calibri" w:hAnsi="Calibri"/>
+                <w:b/>
+                <w:sz w:val="20"/>
+              </w:rPr>
+              <w:t>The following capabilities are explicitly deferred to subsequent production phases:</w:t>
+            </w:r>
+          </w:p>
+          <w:p>
+            <w:pPr>
+              <w:spacing w:after="40" w:before="20" w:line="276" w:lineRule="auto"/>
+              <w:ind w:left="216"/>
+            </w:pPr>
+            <w:r>
+              <w:rPr>
+                <w:rFonts w:ascii="Calibri" w:hAnsi="Calibri"/>
+                <w:b/>
+                <w:sz w:val="20"/>
+              </w:rPr>
+              <w:t xml:space="preserve">• </w:t>
+            </w:r>
+            <w:r>
+              <w:rPr>
+                <w:rFonts w:ascii="Calibri" w:hAnsi="Calibri"/>
+                <w:b/>
+                <w:sz w:val="20"/>
+              </w:rPr>
+              <w:t xml:space="preserve">Database Migrations: </w:t>
+            </w:r>
+            <w:r>
+              <w:rPr>
+                <w:rFonts w:ascii="Calibri" w:hAnsi="Calibri"/>
+                <w:sz w:val="20"/>
+              </w:rPr>
+              <w:t>Zero modifications to PostgreSQL tables, schemas, or indexes (relying strictly on application-layer state and event models).</w:t>
+            </w:r>
+          </w:p>
+          <w:p>
+            <w:pPr>
+              <w:spacing w:after="40" w:before="20" w:line="276" w:lineRule="auto"/>
+              <w:ind w:left="216"/>
+            </w:pPr>
+            <w:r>
+              <w:rPr>
+                <w:rFonts w:ascii="Calibri" w:hAnsi="Calibri"/>
+                <w:b/>
+                <w:sz w:val="20"/>
+              </w:rPr>
+              <w:t xml:space="preserve">• </w:t>
+            </w:r>
+            <w:r>
+              <w:rPr>
+                <w:rFonts w:ascii="Calibri" w:hAnsi="Calibri"/>
+                <w:b/>
+                <w:sz w:val="20"/>
+              </w:rPr>
+              <w:t xml:space="preserve">Enterprise UI / Workbench Redesign: </w:t>
+            </w:r>
+            <w:r>
+              <w:rPr>
+                <w:rFonts w:ascii="Calibri" w:hAnsi="Calibri"/>
+                <w:sz w:val="20"/>
+              </w:rPr>
+              <w:t>Full graphical administration workbench deferred; prototype exposes developer-grade REST APIs.</w:t>
+            </w:r>
+          </w:p>
+          <w:p>
+            <w:pPr>
+              <w:spacing w:after="40" w:before="20" w:line="276" w:lineRule="auto"/>
+              <w:ind w:left="216"/>
+            </w:pPr>
+            <w:r>
+              <w:rPr>
+                <w:rFonts w:ascii="Calibri" w:hAnsi="Calibri"/>
+                <w:b/>
+                <w:sz w:val="20"/>
+              </w:rPr>
+              <w:t xml:space="preserve">• </w:t>
+            </w:r>
+            <w:r>
+              <w:rPr>
+                <w:rFonts w:ascii="Calibri" w:hAnsi="Calibri"/>
+                <w:b/>
+                <w:sz w:val="20"/>
+              </w:rPr>
+              <w:t xml:space="preserve">SSO &amp; Identity Federation: </w:t>
+            </w:r>
+            <w:r>
+              <w:rPr>
+                <w:rFonts w:ascii="Calibri" w:hAnsi="Calibri"/>
+                <w:sz w:val="20"/>
+              </w:rPr>
+              <w:t>Enterprise SAML/OIDC federation deferred; lightweight token-based authentication used for prototype endpoints.</w:t>
+            </w:r>
+          </w:p>
+          <w:p>
+            <w:pPr>
+              <w:spacing w:after="40" w:before="20" w:line="276" w:lineRule="auto"/>
+              <w:ind w:left="216"/>
+            </w:pPr>
+            <w:r>
+              <w:rPr>
+                <w:rFonts w:ascii="Calibri" w:hAnsi="Calibri"/>
+                <w:b/>
+                <w:sz w:val="20"/>
+              </w:rPr>
+              <w:t xml:space="preserve">• </w:t>
+            </w:r>
+            <w:r>
+              <w:rPr>
+                <w:rFonts w:ascii="Calibri" w:hAnsi="Calibri"/>
+                <w:b/>
+                <w:sz w:val="20"/>
+              </w:rPr>
+              <w:t xml:space="preserve">Commercial Billing &amp; Metering: </w:t>
+            </w:r>
+            <w:r>
+              <w:rPr>
+                <w:rFonts w:ascii="Calibri" w:hAnsi="Calibri"/>
+                <w:sz w:val="20"/>
+              </w:rPr>
+              <w:t>Usage metering, billing infrastructure, and formal compliance certifications.</w:t>
+            </w:r>
+          </w:p>
+          <w:p>
+            <w:pPr>
+              <w:spacing w:after="40" w:before="20" w:line="276" w:lineRule="auto"/>
+              <w:ind w:left="216"/>
+            </w:pPr>
+            <w:r>
+              <w:rPr>
+                <w:rFonts w:ascii="Calibri" w:hAnsi="Calibri"/>
+                <w:b/>
+                <w:sz w:val="20"/>
+              </w:rPr>
+              <w:t xml:space="preserve">• </w:t>
+            </w:r>
+            <w:r>
+              <w:rPr>
+                <w:rFonts w:ascii="Calibri" w:hAnsi="Calibri"/>
+                <w:b/>
+                <w:sz w:val="20"/>
+              </w:rPr>
+              <w:t xml:space="preserve">Historical Migration: </w:t>
+            </w:r>
+            <w:r>
+              <w:rPr>
+                <w:rFonts w:ascii="Calibri" w:hAnsi="Calibri"/>
+                <w:sz w:val="20"/>
+              </w:rPr>
+              <w:t>Bulk migration of historical Dospara customer-support archives.</w:t>
             </w:r>
           </w:p>
         </w:tc>
@@ -2199,17 +2152,122 @@
             </w:tcMar>
           </w:tcPr>
           <w:p>
-            <w:pPr>
-              <w:spacing w:before="0" w:after="0" w:line="240" w:lineRule="auto"/>
-            </w:pPr>
-            <w:r>
-              <w:rPr>
-                <w:rFonts w:ascii="Arial" w:hAnsi="Arial"/>
-                <w:b w:val="0"/>
-                <w:i w:val="0"/>
-                <w:sz w:val="17"/>
-              </w:rPr>
-              <w:t>The solution approach is agreed before development starts. The current technology stack is retained: Node.js 22, TypeScript, PostgreSQL 16, OpenSearch and S3-compatible storage. Team members have access to the source repository and a shared development environment. A test identity provider and AI model API access are available to the team.</w:t>
+            <w:r/>
+          </w:p>
+          <w:p>
+            <w:pPr>
+              <w:spacing w:after="40" w:before="20" w:line="276" w:lineRule="auto"/>
+              <w:ind w:left="216"/>
+            </w:pPr>
+            <w:r>
+              <w:rPr>
+                <w:rFonts w:ascii="Calibri" w:hAnsi="Calibri"/>
+                <w:b/>
+                <w:sz w:val="20"/>
+              </w:rPr>
+              <w:t xml:space="preserve">• </w:t>
+            </w:r>
+            <w:r>
+              <w:rPr>
+                <w:rFonts w:ascii="Calibri" w:hAnsi="Calibri"/>
+                <w:b/>
+                <w:sz w:val="20"/>
+              </w:rPr>
+              <w:t xml:space="preserve">Dual-Alternative Evaluation Model: </w:t>
+            </w:r>
+            <w:r>
+              <w:rPr>
+                <w:rFonts w:ascii="Calibri" w:hAnsi="Calibri"/>
+                <w:sz w:val="20"/>
+              </w:rPr>
+              <w:t>Subteam 1 and Subteam 2 execute separate architectural prototypes to evaluate practical usefulness against a common evaluation benchmark.</w:t>
+            </w:r>
+          </w:p>
+          <w:p>
+            <w:pPr>
+              <w:spacing w:after="40" w:before="20" w:line="276" w:lineRule="auto"/>
+              <w:ind w:left="216"/>
+            </w:pPr>
+            <w:r>
+              <w:rPr>
+                <w:rFonts w:ascii="Calibri" w:hAnsi="Calibri"/>
+                <w:b/>
+                <w:sz w:val="20"/>
+              </w:rPr>
+              <w:t xml:space="preserve">• </w:t>
+            </w:r>
+            <w:r>
+              <w:rPr>
+                <w:rFonts w:ascii="Calibri" w:hAnsi="Calibri"/>
+                <w:b/>
+                <w:sz w:val="20"/>
+              </w:rPr>
+              <w:t xml:space="preserve">Non-Invasive Database Handling: </w:t>
+            </w:r>
+            <w:r>
+              <w:rPr>
+                <w:rFonts w:ascii="Calibri" w:hAnsi="Calibri"/>
+                <w:sz w:val="20"/>
+              </w:rPr>
+              <w:t>The application-level epistemic event log satisfies data isolation and audit requirements within the zero-schema-change PostgreSQL boundary.</w:t>
+            </w:r>
+          </w:p>
+          <w:p>
+            <w:pPr>
+              <w:spacing w:after="40" w:before="20" w:line="276" w:lineRule="auto"/>
+              <w:ind w:left="216"/>
+            </w:pPr>
+            <w:r>
+              <w:rPr>
+                <w:rFonts w:ascii="Calibri" w:hAnsi="Calibri"/>
+                <w:b/>
+                <w:sz w:val="20"/>
+              </w:rPr>
+              <w:t xml:space="preserve">• </w:t>
+            </w:r>
+            <w:r>
+              <w:rPr>
+                <w:rFonts w:ascii="Calibri" w:hAnsi="Calibri"/>
+                <w:b/>
+                <w:sz w:val="20"/>
+              </w:rPr>
+              <w:t xml:space="preserve">Baseline Technology Stack: </w:t>
+            </w:r>
+            <w:r>
+              <w:rPr>
+                <w:rFonts w:ascii="Calibri" w:hAnsi="Calibri"/>
+                <w:sz w:val="20"/>
+              </w:rPr>
+              <w:t>Node.js / TypeScript, PostgreSQL 16 (unmodified schema), OpenSearch, and S3-compatible storage.</w:t>
+            </w:r>
+          </w:p>
+          <w:p>
+            <w:pPr>
+              <w:spacing w:after="40" w:before="20" w:line="276" w:lineRule="auto"/>
+              <w:ind w:left="216"/>
+            </w:pPr>
+            <w:r>
+              <w:rPr>
+                <w:rFonts w:ascii="Calibri" w:hAnsi="Calibri"/>
+                <w:b/>
+                <w:sz w:val="20"/>
+              </w:rPr>
+              <w:t xml:space="preserve">• </w:t>
+            </w:r>
+            <w:r>
+              <w:rPr>
+                <w:rFonts w:ascii="Calibri" w:hAnsi="Calibri"/>
+                <w:b/>
+                <w:sz w:val="20"/>
+              </w:rPr>
+              <w:t xml:space="preserve">Infrastructure Access: </w:t>
+            </w:r>
+            <w:r>
+              <w:rPr>
+                <w:rFonts w:ascii="Calibri" w:hAnsi="Calibri"/>
+                <w:sz w:val="20"/>
+              </w:rPr>
+              <w:t>Standard shared development server and AI model inference API access are provisioned.</w:t>
             </w:r>
           </w:p>
         </w:tc>
@@ -2282,17 +2340,122 @@
             </w:tcMar>
           </w:tcPr>
           <w:p>
-            <w:pPr>
-              <w:spacing w:before="0" w:after="0" w:line="240" w:lineRule="auto"/>
-            </w:pPr>
-            <w:r>
-              <w:rPr>
-                <w:rFonts w:ascii="Arial" w:hAnsi="Arial"/>
-                <w:b w:val="0"/>
-                <w:i w:val="0"/>
-                <w:sz w:val="17"/>
-              </w:rPr>
-              <w:t>Development effort: 80 person-hours across a team of three (Subteam 2). Development labour is internal and not charged; project budget ¥27,500 (excluding tax). All project data is confidential and remains within Third Wave Inc.</w:t>
+            <w:r/>
+          </w:p>
+          <w:p>
+            <w:pPr>
+              <w:spacing w:after="40" w:before="20" w:line="276" w:lineRule="auto"/>
+              <w:ind w:left="216"/>
+            </w:pPr>
+            <w:r>
+              <w:rPr>
+                <w:rFonts w:ascii="Calibri" w:hAnsi="Calibri"/>
+                <w:b/>
+                <w:sz w:val="20"/>
+              </w:rPr>
+              <w:t xml:space="preserve">• </w:t>
+            </w:r>
+            <w:r>
+              <w:rPr>
+                <w:rFonts w:ascii="Calibri" w:hAnsi="Calibri"/>
+                <w:b/>
+                <w:sz w:val="20"/>
+              </w:rPr>
+              <w:t xml:space="preserve">Effort Ceiling: </w:t>
+            </w:r>
+            <w:r>
+              <w:rPr>
+                <w:rFonts w:ascii="Calibri" w:hAnsi="Calibri"/>
+                <w:sz w:val="20"/>
+              </w:rPr>
+              <w:t>Strictly capped at 80 person-hours across a 3-member team (Pooja: 30h, Jaiadithya: 30h, Balachandra: 20h).</w:t>
+            </w:r>
+          </w:p>
+          <w:p>
+            <w:pPr>
+              <w:spacing w:after="40" w:before="20" w:line="276" w:lineRule="auto"/>
+              <w:ind w:left="216"/>
+            </w:pPr>
+            <w:r>
+              <w:rPr>
+                <w:rFonts w:ascii="Calibri" w:hAnsi="Calibri"/>
+                <w:b/>
+                <w:sz w:val="20"/>
+              </w:rPr>
+              <w:t xml:space="preserve">• </w:t>
+            </w:r>
+            <w:r>
+              <w:rPr>
+                <w:rFonts w:ascii="Calibri" w:hAnsi="Calibri"/>
+                <w:b/>
+                <w:sz w:val="20"/>
+              </w:rPr>
+              <w:t xml:space="preserve">Budget Ceiling: </w:t>
+            </w:r>
+            <w:r>
+              <w:rPr>
+                <w:rFonts w:ascii="Calibri" w:hAnsi="Calibri"/>
+                <w:sz w:val="20"/>
+              </w:rPr>
+              <w:t>Direct non-labor expenditure capped at ¥27,500 (excluding tax); internal labor at ¥0.</w:t>
+            </w:r>
+          </w:p>
+          <w:p>
+            <w:pPr>
+              <w:spacing w:after="40" w:before="20" w:line="276" w:lineRule="auto"/>
+              <w:ind w:left="216"/>
+            </w:pPr>
+            <w:r>
+              <w:rPr>
+                <w:rFonts w:ascii="Calibri" w:hAnsi="Calibri"/>
+                <w:b/>
+                <w:sz w:val="20"/>
+              </w:rPr>
+              <w:t xml:space="preserve">• </w:t>
+            </w:r>
+            <w:r>
+              <w:rPr>
+                <w:rFonts w:ascii="Calibri" w:hAnsi="Calibri"/>
+                <w:b/>
+                <w:sz w:val="20"/>
+              </w:rPr>
+              <w:t xml:space="preserve">Elapsed Timeline: </w:t>
+            </w:r>
+            <w:r>
+              <w:rPr>
+                <w:rFonts w:ascii="Calibri" w:hAnsi="Calibri"/>
+                <w:sz w:val="20"/>
+              </w:rPr>
+              <w:t>8 calendar weeks (19 October 2026 – 11 December 2026).</w:t>
+            </w:r>
+          </w:p>
+          <w:p>
+            <w:pPr>
+              <w:spacing w:after="40" w:before="20" w:line="276" w:lineRule="auto"/>
+              <w:ind w:left="216"/>
+            </w:pPr>
+            <w:r>
+              <w:rPr>
+                <w:rFonts w:ascii="Calibri" w:hAnsi="Calibri"/>
+                <w:b/>
+                <w:sz w:val="20"/>
+              </w:rPr>
+              <w:t xml:space="preserve">• </w:t>
+            </w:r>
+            <w:r>
+              <w:rPr>
+                <w:rFonts w:ascii="Calibri" w:hAnsi="Calibri"/>
+                <w:b/>
+                <w:sz w:val="20"/>
+              </w:rPr>
+              <w:t xml:space="preserve">Information Security: </w:t>
+            </w:r>
+            <w:r>
+              <w:rPr>
+                <w:rFonts w:ascii="Calibri" w:hAnsi="Calibri"/>
+                <w:sz w:val="20"/>
+              </w:rPr>
+              <w:t>All codebase assets, schemas, and benchmark datasets remain confidential within Third Wave Inc.</w:t>
             </w:r>
           </w:p>
         </w:tc>
@@ -2324,104 +2487,6 @@
         <w:t>3.  Schedule Overview</w:t>
       </w:r>
     </w:p>
-    <w:tbl>
-      <w:tblPr>
-        <w:tblStyle w:val="9"/>
-        <w:tblW w:w="9026" w:type="dxa"/>
-        <w:tblInd w:w="0" w:type="dxa"/>
-        <w:tblBorders>
-          <w:top w:val="single" w:color="auto" w:sz="4" w:space="0"/>
-          <w:left w:val="single" w:color="auto" w:sz="4" w:space="0"/>
-          <w:bottom w:val="single" w:color="auto" w:sz="4" w:space="0"/>
-          <w:right w:val="single" w:color="auto" w:sz="4" w:space="0"/>
-          <w:insideH w:val="single" w:color="auto" w:sz="4" w:space="0"/>
-          <w:insideV w:val="single" w:color="auto" w:sz="4" w:space="0"/>
-        </w:tblBorders>
-        <w:tblLayout w:type="autofit"/>
-        <w:tblCellMar>
-          <w:top w:w="0" w:type="dxa"/>
-          <w:left w:w="10" w:type="dxa"/>
-          <w:bottom w:w="0" w:type="dxa"/>
-          <w:right w:w="10" w:type="dxa"/>
-        </w:tblCellMar>
-      </w:tblPr>
-      <w:tblGrid>
-        <w:gridCol w:w="9026"/>
-      </w:tblGrid>
-      <w:tr>
-        <w:tblPrEx>
-          <w:tblBorders>
-            <w:top w:val="single" w:color="auto" w:sz="4" w:space="0"/>
-            <w:left w:val="single" w:color="auto" w:sz="4" w:space="0"/>
-            <w:bottom w:val="single" w:color="auto" w:sz="4" w:space="0"/>
-            <w:right w:val="single" w:color="auto" w:sz="4" w:space="0"/>
-            <w:insideH w:val="single" w:color="auto" w:sz="4" w:space="0"/>
-            <w:insideV w:val="single" w:color="auto" w:sz="4" w:space="0"/>
-          </w:tblBorders>
-          <w:tblCellMar>
-            <w:top w:w="0" w:type="dxa"/>
-            <w:left w:w="10" w:type="dxa"/>
-            <w:bottom w:w="0" w:type="dxa"/>
-            <w:right w:w="10" w:type="dxa"/>
-          </w:tblCellMar>
-        </w:tblPrEx>
-        <w:tc>
-          <w:tcPr>
-            <w:tcBorders>
-              <w:top w:val="single" w:color="B5C4DE" w:sz="4" w:space="0"/>
-              <w:left w:val="single" w:color="B5C4DE" w:sz="4" w:space="0"/>
-              <w:bottom w:val="single" w:color="B5C4DE" w:sz="4" w:space="0"/>
-              <w:right w:val="single" w:color="B5C4DE" w:sz="4" w:space="0"/>
-            </w:tcBorders>
-            <w:shd w:val="clear" w:color="auto" w:fill="EBF3FB"/>
-            <w:tcMar>
-              <w:top w:w="80" w:type="dxa"/>
-              <w:left w:w="140" w:type="dxa"/>
-              <w:bottom w:w="80" w:type="dxa"/>
-              <w:right w:w="140" w:type="dxa"/>
-            </w:tcMar>
-          </w:tcPr>
-          <w:p>
-            <w:pPr>
-              <w:spacing w:before="0" w:after="40"/>
-              <w:jc w:val="left"/>
-            </w:pPr>
-            <w:r>
-              <w:rPr>
-                <w:rFonts w:ascii="Arial" w:hAnsi="Arial" w:eastAsia="Arial" w:cs="Arial"/>
-                <w:b/>
-                <w:bCs/>
-                <w:i w:val="0"/>
-                <w:iCs w:val="0"/>
-                <w:color w:val="2E75B6"/>
-                <w:sz w:val="18"/>
-                <w:szCs w:val="18"/>
-              </w:rPr>
-              <w:t>Guide</w:t>
-            </w:r>
-          </w:p>
-          <w:p>
-            <w:pPr>
-              <w:spacing w:before="0" w:after="80"/>
-              <w:jc w:val="left"/>
-            </w:pPr>
-            <w:r>
-              <w:rPr>
-                <w:rFonts w:ascii="Arial" w:hAnsi="Arial" w:eastAsia="Arial" w:cs="Arial"/>
-                <w:b w:val="0"/>
-                <w:bCs w:val="0"/>
-                <w:i w:val="0"/>
-                <w:iCs w:val="0"/>
-                <w:color w:val="595959"/>
-                <w:sz w:val="17"/>
-                <w:szCs w:val="17"/>
-              </w:rPr>
-              <w:t>Enter the major phases and their target dates. The full Gantt chart and WBS are in the Project Plan (). This section is the high-level timeline the stakeholder approves.</w:t>
-            </w:r>
-          </w:p>
-        </w:tc>
-      </w:tr>
-    </w:tbl>
     <w:p>
       <w:pPr>
         <w:spacing w:before="80" w:after="0"/>
@@ -2650,18 +2715,10 @@
             </w:tcMar>
           </w:tcPr>
           <w:p>
-            <w:pPr>
-              <w:spacing w:after="80"/>
-            </w:pPr>
-            <w:r>
-              <w:rPr>
-                <w:b/>
-                <w:bCs/>
-                <w:color w:val="000000"/>
-                <w:sz w:val="17"/>
-                <w:szCs w:val="17"/>
-              </w:rPr>
-              <w:t>Phase 1: Detailed Design &amp; Environment Setup</w:t>
+            <w:r>
+              <w:t>Phase 1: Architectural Design &amp; Benchmark Setup</w:t>
+              <w:br/>
+              <w:t>(2026-10-19 – 2026-10-23)</w:t>
             </w:r>
           </w:p>
         </w:tc>
@@ -2684,16 +2741,12 @@
             <w:vAlign w:val="center"/>
           </w:tcPr>
           <w:p>
-            <w:pPr>
-              <w:spacing w:after="80"/>
-            </w:pPr>
-            <w:r>
-              <w:rPr>
-                <w:color w:val="000000"/>
-                <w:sz w:val="18"/>
-                <w:szCs w:val="18"/>
-              </w:rPr>
-              <w:t>Tech Lead, Developer, QA Engineer</w:t>
+            <w:r>
+              <w:t>Pooja (4h)</w:t>
+              <w:br/>
+              <w:t>Jaiadithya (4h)</w:t>
+              <w:br/>
+              <w:t>Balachandra (2h)</w:t>
             </w:r>
           </w:p>
         </w:tc>
@@ -2716,15 +2769,7 @@
             <w:vAlign w:val="center"/>
           </w:tcPr>
           <w:p>
-            <w:pPr>
-              <w:spacing w:after="80"/>
-            </w:pPr>
-            <w:r>
-              <w:rPr>
-                <w:color w:val="000000"/>
-                <w:sz w:val="18"/>
-                <w:szCs w:val="18"/>
-              </w:rPr>
+            <w:r>
               <w:t>10</w:t>
             </w:r>
           </w:p>
@@ -2747,18 +2792,8 @@
             </w:tcMar>
           </w:tcPr>
           <w:p>
-            <w:pPr>
-              <w:spacing w:after="80"/>
-            </w:pPr>
-            <w:r>
-              <w:rPr>
-                <w:i/>
-                <w:iCs/>
-                <w:color w:val="595959"/>
-                <w:sz w:val="16"/>
-                <w:szCs w:val="16"/>
-              </w:rPr>
-              <w:t>Module-level technical design, development environment and CI pipeline, test plan.</w:t>
+            <w:r>
+              <w:t>Alternative B architectural specification, domain-pack schema design, comparative evaluation benchmark criteria, environment setup.</w:t>
             </w:r>
           </w:p>
         </w:tc>
@@ -2801,18 +2836,10 @@
             </w:tcMar>
           </w:tcPr>
           <w:p>
-            <w:pPr>
-              <w:spacing w:after="80"/>
-            </w:pPr>
-            <w:r>
-              <w:rPr>
-                <w:b/>
-                <w:bCs/>
-                <w:color w:val="000000"/>
-                <w:sz w:val="17"/>
-                <w:szCs w:val="17"/>
-              </w:rPr>
-              <w:t>Phase 2: Development – Core Platform</w:t>
+            <w:r>
+              <w:t>Phase 2: Development – Core Action Runtime &amp; Epistemic Layer</w:t>
+              <w:br/>
+              <w:t>(2026-10-26 – 2026-11-06)</w:t>
             </w:r>
           </w:p>
         </w:tc>
@@ -2835,16 +2862,10 @@
             <w:vAlign w:val="center"/>
           </w:tcPr>
           <w:p>
-            <w:pPr>
-              <w:spacing w:after="80"/>
-            </w:pPr>
-            <w:r>
-              <w:rPr>
-                <w:color w:val="000000"/>
-                <w:sz w:val="18"/>
-                <w:szCs w:val="18"/>
-              </w:rPr>
-              <w:t>Tech Lead, Developer</w:t>
+            <w:r>
+              <w:t>Pooja (9h)</w:t>
+              <w:br/>
+              <w:t>Jaiadithya (13h)</w:t>
             </w:r>
           </w:p>
         </w:tc>
@@ -2867,15 +2888,7 @@
             <w:vAlign w:val="center"/>
           </w:tcPr>
           <w:p>
-            <w:pPr>
-              <w:spacing w:after="80"/>
-            </w:pPr>
-            <w:r>
-              <w:rPr>
-                <w:color w:val="000000"/>
-                <w:sz w:val="18"/>
-                <w:szCs w:val="18"/>
-              </w:rPr>
+            <w:r>
               <w:t>22</w:t>
             </w:r>
           </w:p>
@@ -2898,18 +2911,8 @@
             </w:tcMar>
           </w:tcPr>
           <w:p>
-            <w:pPr>
-              <w:spacing w:after="80"/>
-            </w:pPr>
-            <w:r>
-              <w:rPr>
-                <w:i/>
-                <w:iCs/>
-                <w:color w:val="595959"/>
-                <w:sz w:val="16"/>
-                <w:szCs w:val="16"/>
-              </w:rPr>
-              <w:t>Enterprise ontology with state and action engine, domain packs, identity, multi-tenancy, approvals and audit.</w:t>
+            <w:r>
+              <w:t>Ontology state-machine engine, action validation rules, application-level epistemic memory and audit event store (respecting zero-DB migration constraint).</w:t>
             </w:r>
           </w:p>
         </w:tc>
@@ -2952,18 +2955,10 @@
             </w:tcMar>
           </w:tcPr>
           <w:p>
-            <w:pPr>
-              <w:spacing w:after="80"/>
-            </w:pPr>
-            <w:r>
-              <w:rPr>
-                <w:b/>
-                <w:bCs/>
-                <w:color w:val="000000"/>
-                <w:sz w:val="17"/>
-                <w:szCs w:val="17"/>
-              </w:rPr>
-              <w:t>Phase 3: Development – Platform Capabilities</w:t>
+            <w:r>
+              <w:t>Phase 3: Development – Ingestion, Retrieval &amp; API Integration</w:t>
+              <w:br/>
+              <w:t>(2026-11-09 – 2026-11-20)</w:t>
             </w:r>
           </w:p>
         </w:tc>
@@ -2986,16 +2981,10 @@
             <w:vAlign w:val="center"/>
           </w:tcPr>
           <w:p>
-            <w:pPr>
-              <w:spacing w:after="80"/>
-            </w:pPr>
-            <w:r>
-              <w:rPr>
-                <w:color w:val="000000"/>
-                <w:sz w:val="18"/>
-                <w:szCs w:val="18"/>
-              </w:rPr>
-              <w:t>Tech Lead, Developer</w:t>
+            <w:r>
+              <w:t>Pooja (11h)</w:t>
+              <w:br/>
+              <w:t>Jaiadithya (11h)</w:t>
             </w:r>
           </w:p>
         </w:tc>
@@ -3018,15 +3007,7 @@
             <w:vAlign w:val="center"/>
           </w:tcPr>
           <w:p>
-            <w:pPr>
-              <w:spacing w:after="80"/>
-            </w:pPr>
-            <w:r>
-              <w:rPr>
-                <w:color w:val="000000"/>
-                <w:sz w:val="18"/>
-                <w:szCs w:val="18"/>
-              </w:rPr>
+            <w:r>
               <w:t>22</w:t>
             </w:r>
           </w:p>
@@ -3049,18 +3030,8 @@
             </w:tcMar>
           </w:tcPr>
           <w:p>
-            <w:pPr>
-              <w:spacing w:after="80"/>
-            </w:pPr>
-            <w:r>
-              <w:rPr>
-                <w:i/>
-                <w:iCs/>
-                <w:color w:val="595959"/>
-                <w:sz w:val="16"/>
-                <w:szCs w:val="16"/>
-              </w:rPr>
-              <w:t>Cross-document relationship detection, knowledge retrieval, orchestration, agent and model layer, control plane.</w:t>
+            <w:r>
+              <w:t>Declarative domain pack loader, cross-document relationship detection pipeline, REST API endpoints for queries and benchmark evaluation.</w:t>
             </w:r>
           </w:p>
         </w:tc>
@@ -3103,18 +3074,10 @@
             </w:tcMar>
           </w:tcPr>
           <w:p>
-            <w:pPr>
-              <w:spacing w:after="80"/>
-            </w:pPr>
-            <w:r>
-              <w:rPr>
-                <w:b/>
-                <w:bCs/>
-                <w:color w:val="000000"/>
-                <w:sz w:val="17"/>
-                <w:szCs w:val="17"/>
-              </w:rPr>
-              <w:t>Phase 4: Testing &amp; UAT</w:t>
+            <w:r>
+              <w:t>Phase 4: Comparative Evaluation, Quality &amp; Security Validation</w:t>
+              <w:br/>
+              <w:t>(2026-11-23 – 2026-12-04)</w:t>
             </w:r>
           </w:p>
         </w:tc>
@@ -3137,16 +3100,12 @@
             <w:vAlign w:val="center"/>
           </w:tcPr>
           <w:p>
-            <w:pPr>
-              <w:spacing w:after="80"/>
-            </w:pPr>
-            <w:r>
-              <w:rPr>
-                <w:color w:val="000000"/>
-                <w:sz w:val="18"/>
-                <w:szCs w:val="18"/>
-              </w:rPr>
-              <w:t>QA Engineer, with developer support</w:t>
+            <w:r>
+              <w:t>Balachandra (17h)</w:t>
+              <w:br/>
+              <w:t>Jaiadithya (1h)</w:t>
+              <w:br/>
+              <w:t>Pooja (2h)</w:t>
             </w:r>
           </w:p>
         </w:tc>
@@ -3169,15 +3128,7 @@
             <w:vAlign w:val="center"/>
           </w:tcPr>
           <w:p>
-            <w:pPr>
-              <w:spacing w:after="80"/>
-            </w:pPr>
-            <w:r>
-              <w:rPr>
-                <w:color w:val="000000"/>
-                <w:sz w:val="18"/>
-                <w:szCs w:val="18"/>
-              </w:rPr>
+            <w:r>
               <w:t>20</w:t>
             </w:r>
           </w:p>
@@ -3200,18 +3151,8 @@
             </w:tcMar>
           </w:tcPr>
           <w:p>
-            <w:pPr>
-              <w:spacing w:after="80"/>
-            </w:pPr>
-            <w:r>
-              <w:rPr>
-                <w:i/>
-                <w:iCs/>
-                <w:color w:val="595959"/>
-                <w:sz w:val="16"/>
-                <w:szCs w:val="16"/>
-              </w:rPr>
-              <w:t>Functional, security, multi-tenancy and performance testing; defect fixing; UAT support.</w:t>
+            <w:r>
+              <w:t>Execution of standardized evaluation benchmark, precision/recall verification, tenant isolation testing, security assessment report.</w:t>
             </w:r>
           </w:p>
         </w:tc>
@@ -3254,18 +3195,10 @@
             </w:tcMar>
           </w:tcPr>
           <w:p>
-            <w:pPr>
-              <w:spacing w:after="80"/>
-            </w:pPr>
-            <w:r>
-              <w:rPr>
-                <w:b/>
-                <w:bCs/>
-                <w:color w:val="000000"/>
-                <w:sz w:val="17"/>
-                <w:szCs w:val="17"/>
-              </w:rPr>
-              <w:t>Phase 5: Release &amp; Handover</w:t>
+            <w:r>
+              <w:t>Phase 5: Release, Alternative Comparison &amp; Handover</w:t>
+              <w:br/>
+              <w:t>(2026-12-07 – 2026-12-11)</w:t>
             </w:r>
           </w:p>
         </w:tc>
@@ -3288,16 +3221,12 @@
             <w:vAlign w:val="center"/>
           </w:tcPr>
           <w:p>
-            <w:pPr>
-              <w:spacing w:after="80"/>
-            </w:pPr>
-            <w:r>
-              <w:rPr>
-                <w:color w:val="000000"/>
-                <w:sz w:val="18"/>
-                <w:szCs w:val="18"/>
-              </w:rPr>
-              <w:t>Tech Lead, Developer, QA Engineer</w:t>
+            <w:r>
+              <w:t>Pooja (4h)</w:t>
+              <w:br/>
+              <w:t>Jaiadithya (1h)</w:t>
+              <w:br/>
+              <w:t>Balachandra (1h)</w:t>
             </w:r>
           </w:p>
         </w:tc>
@@ -3320,15 +3249,7 @@
             <w:vAlign w:val="center"/>
           </w:tcPr>
           <w:p>
-            <w:pPr>
-              <w:spacing w:after="80"/>
-            </w:pPr>
-            <w:r>
-              <w:rPr>
-                <w:color w:val="000000"/>
-                <w:sz w:val="18"/>
-                <w:szCs w:val="18"/>
-              </w:rPr>
+            <w:r>
               <w:t>6</w:t>
             </w:r>
           </w:p>
@@ -3351,18 +3272,8 @@
             </w:tcMar>
           </w:tcPr>
           <w:p>
-            <w:pPr>
-              <w:spacing w:after="80"/>
-            </w:pPr>
-            <w:r>
-              <w:rPr>
-                <w:i/>
-                <w:iCs/>
-                <w:color w:val="595959"/>
-                <w:sz w:val="16"/>
-                <w:szCs w:val="16"/>
-              </w:rPr>
-              <w:t>Release preparation, technical documentation, handover and closure report.</w:t>
+            <w:r>
+              <w:t>Alternative B prototype package, comparative evaluation report (Alternative A vs B findings), technical documentation and handover.</w:t>
             </w:r>
           </w:p>
         </w:tc>
@@ -3405,17 +3316,7 @@
             </w:tcMar>
           </w:tcPr>
           <w:p>
-            <w:pPr>
-              <w:spacing w:after="80"/>
-            </w:pPr>
-            <w:r>
-              <w:rPr>
-                <w:b/>
-                <w:bCs/>
-                <w:color w:val="000000"/>
-                <w:sz w:val="17"/>
-                <w:szCs w:val="17"/>
-              </w:rPr>
+            <w:r>
               <w:t>Total</w:t>
             </w:r>
           </w:p>
@@ -3439,16 +3340,8 @@
             <w:vAlign w:val="center"/>
           </w:tcPr>
           <w:p>
-            <w:pPr>
-              <w:spacing w:after="80"/>
-            </w:pPr>
-            <w:r>
-              <w:rPr>
-                <w:color w:val="000000"/>
-                <w:sz w:val="18"/>
-                <w:szCs w:val="18"/>
-              </w:rPr>
-              <w:t>Development team (3)</w:t>
+            <w:r>
+              <w:t>Pooja: 30h | Jaiadithya: 30h | Balachandra: 20h</w:t>
             </w:r>
           </w:p>
         </w:tc>
@@ -3471,15 +3364,7 @@
             <w:vAlign w:val="center"/>
           </w:tcPr>
           <w:p>
-            <w:pPr>
-              <w:spacing w:after="80"/>
-            </w:pPr>
-            <w:r>
-              <w:rPr>
-                <w:color w:val="000000"/>
-                <w:sz w:val="18"/>
-                <w:szCs w:val="18"/>
-              </w:rPr>
+            <w:r>
               <w:t>80</w:t>
             </w:r>
           </w:p>
@@ -3502,9 +3387,9 @@
             </w:tcMar>
           </w:tcPr>
           <w:p>
-            <w:pPr>
-              <w:spacing w:after="80"/>
-            </w:pPr>
+            <w:r>
+              <w:t>Completed 80-hour prototype evaluation</w:t>
+            </w:r>
           </w:p>
         </w:tc>
       </w:tr>
@@ -3535,104 +3420,6 @@
         <w:t>4.  Budget Overview</w:t>
       </w:r>
     </w:p>
-    <w:tbl>
-      <w:tblPr>
-        <w:tblStyle w:val="9"/>
-        <w:tblW w:w="9026" w:type="dxa"/>
-        <w:tblInd w:w="0" w:type="dxa"/>
-        <w:tblBorders>
-          <w:top w:val="single" w:color="auto" w:sz="4" w:space="0"/>
-          <w:left w:val="single" w:color="auto" w:sz="4" w:space="0"/>
-          <w:bottom w:val="single" w:color="auto" w:sz="4" w:space="0"/>
-          <w:right w:val="single" w:color="auto" w:sz="4" w:space="0"/>
-          <w:insideH w:val="single" w:color="auto" w:sz="4" w:space="0"/>
-          <w:insideV w:val="single" w:color="auto" w:sz="4" w:space="0"/>
-        </w:tblBorders>
-        <w:tblLayout w:type="autofit"/>
-        <w:tblCellMar>
-          <w:top w:w="0" w:type="dxa"/>
-          <w:left w:w="10" w:type="dxa"/>
-          <w:bottom w:w="0" w:type="dxa"/>
-          <w:right w:w="10" w:type="dxa"/>
-        </w:tblCellMar>
-      </w:tblPr>
-      <w:tblGrid>
-        <w:gridCol w:w="9026"/>
-      </w:tblGrid>
-      <w:tr>
-        <w:tblPrEx>
-          <w:tblBorders>
-            <w:top w:val="single" w:color="auto" w:sz="4" w:space="0"/>
-            <w:left w:val="single" w:color="auto" w:sz="4" w:space="0"/>
-            <w:bottom w:val="single" w:color="auto" w:sz="4" w:space="0"/>
-            <w:right w:val="single" w:color="auto" w:sz="4" w:space="0"/>
-            <w:insideH w:val="single" w:color="auto" w:sz="4" w:space="0"/>
-            <w:insideV w:val="single" w:color="auto" w:sz="4" w:space="0"/>
-          </w:tblBorders>
-          <w:tblCellMar>
-            <w:top w:w="0" w:type="dxa"/>
-            <w:left w:w="10" w:type="dxa"/>
-            <w:bottom w:w="0" w:type="dxa"/>
-            <w:right w:w="10" w:type="dxa"/>
-          </w:tblCellMar>
-        </w:tblPrEx>
-        <w:tc>
-          <w:tcPr>
-            <w:tcBorders>
-              <w:top w:val="single" w:color="B5C4DE" w:sz="4" w:space="0"/>
-              <w:left w:val="single" w:color="B5C4DE" w:sz="4" w:space="0"/>
-              <w:bottom w:val="single" w:color="B5C4DE" w:sz="4" w:space="0"/>
-              <w:right w:val="single" w:color="B5C4DE" w:sz="4" w:space="0"/>
-            </w:tcBorders>
-            <w:shd w:val="clear" w:color="auto" w:fill="EBF3FB"/>
-            <w:tcMar>
-              <w:top w:w="80" w:type="dxa"/>
-              <w:left w:w="140" w:type="dxa"/>
-              <w:bottom w:w="80" w:type="dxa"/>
-              <w:right w:w="140" w:type="dxa"/>
-            </w:tcMar>
-          </w:tcPr>
-          <w:p>
-            <w:pPr>
-              <w:spacing w:before="0" w:after="40"/>
-              <w:jc w:val="left"/>
-            </w:pPr>
-            <w:r>
-              <w:rPr>
-                <w:rFonts w:ascii="Arial" w:hAnsi="Arial" w:eastAsia="Arial" w:cs="Arial"/>
-                <w:b/>
-                <w:bCs/>
-                <w:i w:val="0"/>
-                <w:iCs w:val="0"/>
-                <w:color w:val="2E75B6"/>
-                <w:sz w:val="18"/>
-                <w:szCs w:val="18"/>
-              </w:rPr>
-              <w:t>Guide</w:t>
-            </w:r>
-          </w:p>
-          <w:p>
-            <w:pPr>
-              <w:spacing w:before="0" w:after="80"/>
-              <w:jc w:val="left"/>
-            </w:pPr>
-            <w:r>
-              <w:rPr>
-                <w:rFonts w:ascii="Arial" w:hAnsi="Arial" w:eastAsia="Arial" w:cs="Arial"/>
-                <w:b w:val="0"/>
-                <w:bCs w:val="0"/>
-                <w:i w:val="0"/>
-                <w:iCs w:val="0"/>
-                <w:color w:val="595959"/>
-                <w:sz w:val="17"/>
-                <w:szCs w:val="17"/>
-              </w:rPr>
-              <w:t>Enter the total budget and main cost categories. Detailed tracking is in the Budget Tracking Sheet (). The stakeholder approves the total here.</w:t>
-            </w:r>
-          </w:p>
-        </w:tc>
-      </w:tr>
-    </w:tbl>
     <w:p>
       <w:pPr>
         <w:spacing w:before="80" w:after="0"/>
@@ -3881,17 +3668,8 @@
             </w:tcMar>
           </w:tcPr>
           <w:p>
-            <w:pPr>
-              <w:spacing w:before="0" w:after="0" w:line="240" w:lineRule="auto"/>
-            </w:pPr>
-            <w:r>
-              <w:rPr>
-                <w:rFonts w:ascii="Arial" w:hAnsi="Arial"/>
-                <w:b w:val="0"/>
-                <w:i w:val="0"/>
-                <w:sz w:val="16"/>
-              </w:rPr>
-              <w:t>Internal team — no outsourcing (80 person-hours across 3 members)</w:t>
+            <w:r>
+              <w:t>Internal engineering team — 80 person-hours across 3 members (¥0 chargeback)</w:t>
             </w:r>
           </w:p>
         </w:tc>
@@ -3996,17 +3774,8 @@
             </w:tcMar>
           </w:tcPr>
           <w:p>
-            <w:pPr>
-              <w:spacing w:before="0" w:after="0" w:line="240" w:lineRule="auto"/>
-            </w:pPr>
-            <w:r>
-              <w:rPr>
-                <w:rFonts w:ascii="Arial" w:hAnsi="Arial"/>
-                <w:b w:val="0"/>
-                <w:i w:val="0"/>
-                <w:sz w:val="16"/>
-              </w:rPr>
-              <w:t>One small cloud test server; local development on existing machines</w:t>
+            <w:r>
+              <w:t>Dedicated container sandbox and test server instance for Alternative B prototype</w:t>
             </w:r>
           </w:p>
         </w:tc>
@@ -4111,17 +3880,8 @@
             </w:tcMar>
           </w:tcPr>
           <w:p>
-            <w:pPr>
-              <w:spacing w:before="0" w:after="0" w:line="240" w:lineRule="auto"/>
-            </w:pPr>
-            <w:r>
-              <w:rPr>
-                <w:rFonts w:ascii="Arial" w:hAnsi="Arial"/>
-                <w:b w:val="0"/>
-                <w:i w:val="0"/>
-                <w:sz w:val="16"/>
-              </w:rPr>
-              <w:t>Open-source stack with no licence fees; AI model API usage for testing</w:t>
+            <w:r>
+              <w:t>Open-source core stack; AI model API inference allowance for benchmark evaluation</w:t>
             </w:r>
           </w:p>
         </w:tc>
@@ -4226,17 +3986,8 @@
             </w:tcMar>
           </w:tcPr>
           <w:p>
-            <w:pPr>
-              <w:spacing w:before="0" w:after="0" w:line="240" w:lineRule="auto"/>
-            </w:pPr>
-            <w:r>
-              <w:rPr>
-                <w:rFonts w:ascii="Arial" w:hAnsi="Arial"/>
-                <w:b w:val="0"/>
-                <w:i w:val="0"/>
-                <w:sz w:val="16"/>
-              </w:rPr>
-              <w:t>No travel or external services</w:t>
+            <w:r>
+              <w:t>No outsourced services or travel expenses required</w:t>
             </w:r>
           </w:p>
         </w:tc>
@@ -4341,17 +4092,8 @@
             </w:tcMar>
           </w:tcPr>
           <w:p>
-            <w:pPr>
-              <w:spacing w:before="0" w:after="0" w:line="240" w:lineRule="auto"/>
-            </w:pPr>
-            <w:r>
-              <w:rPr>
-                <w:rFonts w:ascii="Arial" w:hAnsi="Arial"/>
-                <w:b w:val="0"/>
-                <w:i w:val="0"/>
-                <w:sz w:val="16"/>
-              </w:rPr>
-              <w:t>10% risk buffer on non-labor direct expenses</w:t>
+            <w:r>
+              <w:t>10% contingency buffer on non-labor direct expenses</w:t>
             </w:r>
           </w:p>
         </w:tc>
@@ -4458,17 +4200,8 @@
             <w:vAlign w:val="center"/>
           </w:tcPr>
           <w:p>
-            <w:pPr>
-              <w:spacing w:before="0" w:after="0" w:line="240" w:lineRule="auto"/>
-            </w:pPr>
-            <w:r>
-              <w:rPr>
-                <w:rFonts w:ascii="Arial" w:hAnsi="Arial"/>
-                <w:b/>
-                <w:i w:val="0"/>
-                <w:sz w:val="16"/>
-              </w:rPr>
-              <w:t>Excluding tax</w:t>
+            <w:r>
+              <w:t>Subteam 2 independent allocation (excluding tax)</w:t>
             </w:r>
           </w:p>
         </w:tc>
@@ -5106,17 +4839,8 @@
             </w:tcMar>
           </w:tcPr>
           <w:p>
-            <w:pPr>
-              <w:spacing w:before="0" w:after="0" w:line="240" w:lineRule="auto"/>
-            </w:pPr>
-            <w:r>
-              <w:rPr>
-                <w:rFonts w:ascii="Arial" w:hAnsi="Arial"/>
-                <w:b w:val="0"/>
-                <w:i w:val="0"/>
-                <w:sz w:val="16"/>
-              </w:rPr>
-              <w:t>Architecture, technical decisions, development, code review (30 h)</w:t>
+            <w:r>
+              <w:t>System architecture, ontology schema design, alternative comparison coordination, code reviews (30 h)</w:t>
             </w:r>
           </w:p>
         </w:tc>
@@ -5254,17 +4978,8 @@
             </w:tcMar>
           </w:tcPr>
           <w:p>
-            <w:pPr>
-              <w:spacing w:before="0" w:after="0" w:line="240" w:lineRule="auto"/>
-            </w:pPr>
-            <w:r>
-              <w:rPr>
-                <w:rFonts w:ascii="Arial" w:hAnsi="Arial"/>
-                <w:b w:val="0"/>
-                <w:i w:val="0"/>
-                <w:sz w:val="16"/>
-              </w:rPr>
-              <w:t>Core platform development, action runtime, ontology engine, unit testing (30 h)</w:t>
+            <w:r>
+              <w:t>Core action runtime development, epistemic memory engine, API endpoints, integration (30 h)</w:t>
             </w:r>
           </w:p>
         </w:tc>
@@ -5402,17 +5117,8 @@
             </w:tcMar>
           </w:tcPr>
           <w:p>
-            <w:pPr>
-              <w:spacing w:before="0" w:after="0" w:line="240" w:lineRule="auto"/>
-            </w:pPr>
-            <w:r>
-              <w:rPr>
-                <w:rFonts w:ascii="Arial" w:hAnsi="Arial"/>
-                <w:b w:val="0"/>
-                <w:i w:val="0"/>
-                <w:sz w:val="16"/>
-              </w:rPr>
-              <w:t>Test planning, test execution, benchmark evaluation, defect management (20 h)</w:t>
+            <w:r>
+              <w:t>Benchmark test plan, test execution, tenant isolation checks, security validation, defect tracking (20 h)</w:t>
             </w:r>
           </w:p>
         </w:tc>
@@ -5444,104 +5150,6 @@
         <w:t>6.  Key Risks</w:t>
       </w:r>
     </w:p>
-    <w:tbl>
-      <w:tblPr>
-        <w:tblStyle w:val="9"/>
-        <w:tblW w:w="9026" w:type="dxa"/>
-        <w:tblInd w:w="0" w:type="dxa"/>
-        <w:tblBorders>
-          <w:top w:val="single" w:color="auto" w:sz="4" w:space="0"/>
-          <w:left w:val="single" w:color="auto" w:sz="4" w:space="0"/>
-          <w:bottom w:val="single" w:color="auto" w:sz="4" w:space="0"/>
-          <w:right w:val="single" w:color="auto" w:sz="4" w:space="0"/>
-          <w:insideH w:val="single" w:color="auto" w:sz="4" w:space="0"/>
-          <w:insideV w:val="single" w:color="auto" w:sz="4" w:space="0"/>
-        </w:tblBorders>
-        <w:tblLayout w:type="autofit"/>
-        <w:tblCellMar>
-          <w:top w:w="0" w:type="dxa"/>
-          <w:left w:w="10" w:type="dxa"/>
-          <w:bottom w:w="0" w:type="dxa"/>
-          <w:right w:w="10" w:type="dxa"/>
-        </w:tblCellMar>
-      </w:tblPr>
-      <w:tblGrid>
-        <w:gridCol w:w="9026"/>
-      </w:tblGrid>
-      <w:tr>
-        <w:tblPrEx>
-          <w:tblBorders>
-            <w:top w:val="single" w:color="auto" w:sz="4" w:space="0"/>
-            <w:left w:val="single" w:color="auto" w:sz="4" w:space="0"/>
-            <w:bottom w:val="single" w:color="auto" w:sz="4" w:space="0"/>
-            <w:right w:val="single" w:color="auto" w:sz="4" w:space="0"/>
-            <w:insideH w:val="single" w:color="auto" w:sz="4" w:space="0"/>
-            <w:insideV w:val="single" w:color="auto" w:sz="4" w:space="0"/>
-          </w:tblBorders>
-          <w:tblCellMar>
-            <w:top w:w="0" w:type="dxa"/>
-            <w:left w:w="10" w:type="dxa"/>
-            <w:bottom w:w="0" w:type="dxa"/>
-            <w:right w:w="10" w:type="dxa"/>
-          </w:tblCellMar>
-        </w:tblPrEx>
-        <w:tc>
-          <w:tcPr>
-            <w:tcBorders>
-              <w:top w:val="single" w:color="B5C4DE" w:sz="4" w:space="0"/>
-              <w:left w:val="single" w:color="B5C4DE" w:sz="4" w:space="0"/>
-              <w:bottom w:val="single" w:color="B5C4DE" w:sz="4" w:space="0"/>
-              <w:right w:val="single" w:color="B5C4DE" w:sz="4" w:space="0"/>
-            </w:tcBorders>
-            <w:shd w:val="clear" w:color="auto" w:fill="EBF3FB"/>
-            <w:tcMar>
-              <w:top w:w="80" w:type="dxa"/>
-              <w:left w:w="140" w:type="dxa"/>
-              <w:bottom w:w="80" w:type="dxa"/>
-              <w:right w:w="140" w:type="dxa"/>
-            </w:tcMar>
-          </w:tcPr>
-          <w:p>
-            <w:pPr>
-              <w:spacing w:before="0" w:after="40"/>
-              <w:jc w:val="left"/>
-            </w:pPr>
-            <w:r>
-              <w:rPr>
-                <w:rFonts w:ascii="Arial" w:hAnsi="Arial" w:eastAsia="Arial" w:cs="Arial"/>
-                <w:b/>
-                <w:bCs/>
-                <w:i w:val="0"/>
-                <w:iCs w:val="0"/>
-                <w:color w:val="2E75B6"/>
-                <w:sz w:val="18"/>
-                <w:szCs w:val="18"/>
-              </w:rPr>
-              <w:t>Guide</w:t>
-            </w:r>
-          </w:p>
-          <w:p>
-            <w:pPr>
-              <w:spacing w:before="0" w:after="80"/>
-              <w:jc w:val="left"/>
-            </w:pPr>
-            <w:r>
-              <w:rPr>
-                <w:rFonts w:ascii="Arial" w:hAnsi="Arial" w:eastAsia="Arial" w:cs="Arial"/>
-                <w:b w:val="0"/>
-                <w:bCs w:val="0"/>
-                <w:i w:val="0"/>
-                <w:iCs w:val="0"/>
-                <w:color w:val="595959"/>
-                <w:sz w:val="17"/>
-                <w:szCs w:val="17"/>
-              </w:rPr>
-              <w:t>List the top risks anticipated at project start. Full risk tracking is in the Project Management Log () Issue &amp; Risk Log.</w:t>
-            </w:r>
-          </w:p>
-        </w:tc>
-      </w:tr>
-    </w:tbl>
     <w:p>
       <w:pPr>
         <w:spacing w:before="80" w:after="0"/>
@@ -5826,17 +5434,8 @@
             </w:tcMar>
           </w:tcPr>
           <w:p>
-            <w:pPr>
-              <w:spacing w:before="0" w:after="0" w:line="240" w:lineRule="auto"/>
-            </w:pPr>
-            <w:r>
-              <w:rPr>
-                <w:rFonts w:ascii="Arial" w:hAnsi="Arial"/>
-                <w:b w:val="0"/>
-                <w:i w:val="0"/>
-                <w:sz w:val="17"/>
-              </w:rPr>
-              <w:t>Development effort exceeds the 80 person-hour estimate</w:t>
+            <w:r>
+              <w:t>Development effort exceeds the 80 person-hour allocation</w:t>
             </w:r>
           </w:p>
         </w:tc>
@@ -5859,16 +5458,7 @@
             <w:vAlign w:val="center"/>
           </w:tcPr>
           <w:p>
-            <w:pPr>
-              <w:spacing w:before="0" w:after="0" w:line="240" w:lineRule="auto"/>
-            </w:pPr>
-            <w:r>
-              <w:rPr>
-                <w:rFonts w:ascii="Arial" w:hAnsi="Arial"/>
-                <w:b w:val="0"/>
-                <w:i w:val="0"/>
-                <w:sz w:val="18"/>
-              </w:rPr>
+            <w:r>
               <w:t>High</w:t>
             </w:r>
           </w:p>
@@ -5892,17 +5482,8 @@
             <w:vAlign w:val="center"/>
           </w:tcPr>
           <w:p>
-            <w:pPr>
-              <w:spacing w:before="0" w:after="0" w:line="240" w:lineRule="auto"/>
-            </w:pPr>
-            <w:r>
-              <w:rPr>
-                <w:rFonts w:ascii="Arial" w:hAnsi="Arial"/>
-                <w:b w:val="0"/>
-                <w:i w:val="0"/>
-                <w:sz w:val="18"/>
-              </w:rPr>
-              <w:t>Low</w:t>
+            <w:r>
+              <w:t>Medium</w:t>
             </w:r>
           </w:p>
         </w:tc>
@@ -5924,17 +5505,8 @@
             </w:tcMar>
           </w:tcPr>
           <w:p>
-            <w:pPr>
-              <w:spacing w:before="0" w:after="0" w:line="240" w:lineRule="auto"/>
-            </w:pPr>
-            <w:r>
-              <w:rPr>
-                <w:rFonts w:ascii="Arial" w:hAnsi="Arial"/>
-                <w:b w:val="0"/>
-                <w:i w:val="0"/>
-                <w:sz w:val="16"/>
-              </w:rPr>
-              <w:t>Prioritise foundation work, track effort weekly, and manage changes via Change Request Form; defer lower-priority items.</w:t>
+            <w:r>
+              <w:t>Strictly bound prototype to core action runtime and retrieval; defer GUI overhaul and SSO to future roadmap; track hours weekly by deliverable.</w:t>
             </w:r>
           </w:p>
         </w:tc>
@@ -6007,17 +5579,8 @@
             </w:tcMar>
           </w:tcPr>
           <w:p>
-            <w:pPr>
-              <w:spacing w:before="0" w:after="0" w:line="240" w:lineRule="auto"/>
-            </w:pPr>
-            <w:r>
-              <w:rPr>
-                <w:rFonts w:ascii="Arial" w:hAnsi="Arial"/>
-                <w:b w:val="0"/>
-                <w:i w:val="0"/>
-                <w:sz w:val="17"/>
-              </w:rPr>
-              <w:t>Replacing customer-support modules disrupts existing functions</w:t>
+            <w:r>
+              <w:t>PostgreSQL zero-migration constraint limits data model complexity</w:t>
             </w:r>
           </w:p>
         </w:tc>
@@ -6040,16 +5603,7 @@
             <w:vAlign w:val="center"/>
           </w:tcPr>
           <w:p>
-            <w:pPr>
-              <w:spacing w:before="0" w:after="0" w:line="240" w:lineRule="auto"/>
-            </w:pPr>
-            <w:r>
-              <w:rPr>
-                <w:rFonts w:ascii="Arial" w:hAnsi="Arial"/>
-                <w:b w:val="0"/>
-                <w:i w:val="0"/>
-                <w:sz w:val="18"/>
-              </w:rPr>
+            <w:r>
               <w:t>Medium</w:t>
             </w:r>
           </w:p>
@@ -6073,16 +5627,7 @@
             <w:vAlign w:val="center"/>
           </w:tcPr>
           <w:p>
-            <w:pPr>
-              <w:spacing w:before="0" w:after="0" w:line="240" w:lineRule="auto"/>
-            </w:pPr>
-            <w:r>
-              <w:rPr>
-                <w:rFonts w:ascii="Arial" w:hAnsi="Arial"/>
-                <w:b w:val="0"/>
-                <w:i w:val="0"/>
-                <w:sz w:val="18"/>
-              </w:rPr>
+            <w:r>
               <w:t>Medium</w:t>
             </w:r>
           </w:p>
@@ -6105,17 +5650,8 @@
             </w:tcMar>
           </w:tcPr>
           <w:p>
-            <w:pPr>
-              <w:spacing w:before="0" w:after="0" w:line="240" w:lineRule="auto"/>
-            </w:pPr>
-            <w:r>
-              <w:rPr>
-                <w:rFonts w:ascii="Arial" w:hAnsi="Arial"/>
-                <w:b w:val="0"/>
-                <w:i w:val="0"/>
-                <w:sz w:val="16"/>
-              </w:rPr>
-              <w:t>Introduce domain-pack structure first and maintain automated tests before removing legacy modules.</w:t>
+            <w:r>
+              <w:t>Implement state tracking and audit logging in an application-level epistemic event log and JSON-LD layer, preserving unmodified database tables.</w:t>
             </w:r>
           </w:p>
         </w:tc>
@@ -6188,16 +5724,7 @@
             </w:tcMar>
           </w:tcPr>
           <w:p>
-            <w:pPr>
-              <w:spacing w:before="0" w:after="0" w:line="240" w:lineRule="auto"/>
-            </w:pPr>
-            <w:r>
-              <w:rPr>
-                <w:rFonts w:ascii="Arial" w:hAnsi="Arial"/>
-                <w:b w:val="0"/>
-                <w:i w:val="0"/>
-                <w:sz w:val="17"/>
-              </w:rPr>
+            <w:r>
               <w:t>AI relationship-detection and extraction accuracy below target</w:t>
             </w:r>
           </w:p>
@@ -6221,16 +5748,7 @@
             <w:vAlign w:val="center"/>
           </w:tcPr>
           <w:p>
-            <w:pPr>
-              <w:spacing w:before="0" w:after="0" w:line="240" w:lineRule="auto"/>
-            </w:pPr>
-            <w:r>
-              <w:rPr>
-                <w:rFonts w:ascii="Arial" w:hAnsi="Arial"/>
-                <w:b w:val="0"/>
-                <w:i w:val="0"/>
-                <w:sz w:val="18"/>
-              </w:rPr>
+            <w:r>
               <w:t>Medium</w:t>
             </w:r>
           </w:p>
@@ -6254,16 +5772,7 @@
             <w:vAlign w:val="center"/>
           </w:tcPr>
           <w:p>
-            <w:pPr>
-              <w:spacing w:before="0" w:after="0" w:line="240" w:lineRule="auto"/>
-            </w:pPr>
-            <w:r>
-              <w:rPr>
-                <w:rFonts w:ascii="Arial" w:hAnsi="Arial"/>
-                <w:b w:val="0"/>
-                <w:i w:val="0"/>
-                <w:sz w:val="18"/>
-              </w:rPr>
+            <w:r>
               <w:t>Medium</w:t>
             </w:r>
           </w:p>
@@ -6286,17 +5795,8 @@
             </w:tcMar>
           </w:tcPr>
           <w:p>
-            <w:pPr>
-              <w:spacing w:before="0" w:after="0" w:line="240" w:lineRule="auto"/>
-            </w:pPr>
-            <w:r>
-              <w:rPr>
-                <w:rFonts w:ascii="Arial" w:hAnsi="Arial"/>
-                <w:b w:val="0"/>
-                <w:i w:val="0"/>
-                <w:sz w:val="16"/>
-              </w:rPr>
-              <w:t>Human review of low-confidence results; evaluation dataset checked before each release.</w:t>
+            <w:r>
+              <w:t>Calibrate confidence thresholds against domain benchmark datasets; maintain human-in-the-loop review for borderline extractions.</w:t>
             </w:r>
           </w:p>
         </w:tc>
@@ -6328,104 +5828,6 @@
         <w:t>7.  Success Criteria</w:t>
       </w:r>
     </w:p>
-    <w:tbl>
-      <w:tblPr>
-        <w:tblStyle w:val="9"/>
-        <w:tblW w:w="9026" w:type="dxa"/>
-        <w:tblInd w:w="0" w:type="dxa"/>
-        <w:tblBorders>
-          <w:top w:val="single" w:color="auto" w:sz="4" w:space="0"/>
-          <w:left w:val="single" w:color="auto" w:sz="4" w:space="0"/>
-          <w:bottom w:val="single" w:color="auto" w:sz="4" w:space="0"/>
-          <w:right w:val="single" w:color="auto" w:sz="4" w:space="0"/>
-          <w:insideH w:val="single" w:color="auto" w:sz="4" w:space="0"/>
-          <w:insideV w:val="single" w:color="auto" w:sz="4" w:space="0"/>
-        </w:tblBorders>
-        <w:tblLayout w:type="autofit"/>
-        <w:tblCellMar>
-          <w:top w:w="0" w:type="dxa"/>
-          <w:left w:w="10" w:type="dxa"/>
-          <w:bottom w:w="0" w:type="dxa"/>
-          <w:right w:w="10" w:type="dxa"/>
-        </w:tblCellMar>
-      </w:tblPr>
-      <w:tblGrid>
-        <w:gridCol w:w="9026"/>
-      </w:tblGrid>
-      <w:tr>
-        <w:tblPrEx>
-          <w:tblBorders>
-            <w:top w:val="single" w:color="auto" w:sz="4" w:space="0"/>
-            <w:left w:val="single" w:color="auto" w:sz="4" w:space="0"/>
-            <w:bottom w:val="single" w:color="auto" w:sz="4" w:space="0"/>
-            <w:right w:val="single" w:color="auto" w:sz="4" w:space="0"/>
-            <w:insideH w:val="single" w:color="auto" w:sz="4" w:space="0"/>
-            <w:insideV w:val="single" w:color="auto" w:sz="4" w:space="0"/>
-          </w:tblBorders>
-          <w:tblCellMar>
-            <w:top w:w="0" w:type="dxa"/>
-            <w:left w:w="10" w:type="dxa"/>
-            <w:bottom w:w="0" w:type="dxa"/>
-            <w:right w:w="10" w:type="dxa"/>
-          </w:tblCellMar>
-        </w:tblPrEx>
-        <w:tc>
-          <w:tcPr>
-            <w:tcBorders>
-              <w:top w:val="single" w:color="B5C4DE" w:sz="4" w:space="0"/>
-              <w:left w:val="single" w:color="B5C4DE" w:sz="4" w:space="0"/>
-              <w:bottom w:val="single" w:color="B5C4DE" w:sz="4" w:space="0"/>
-              <w:right w:val="single" w:color="B5C4DE" w:sz="4" w:space="0"/>
-            </w:tcBorders>
-            <w:shd w:val="clear" w:color="auto" w:fill="EBF3FB"/>
-            <w:tcMar>
-              <w:top w:w="80" w:type="dxa"/>
-              <w:left w:w="140" w:type="dxa"/>
-              <w:bottom w:w="80" w:type="dxa"/>
-              <w:right w:w="140" w:type="dxa"/>
-            </w:tcMar>
-          </w:tcPr>
-          <w:p>
-            <w:pPr>
-              <w:spacing w:before="0" w:after="40"/>
-              <w:jc w:val="left"/>
-            </w:pPr>
-            <w:r>
-              <w:rPr>
-                <w:rFonts w:ascii="Arial" w:hAnsi="Arial" w:eastAsia="Arial" w:cs="Arial"/>
-                <w:b/>
-                <w:bCs/>
-                <w:i w:val="0"/>
-                <w:iCs w:val="0"/>
-                <w:color w:val="2E75B6"/>
-                <w:sz w:val="18"/>
-                <w:szCs w:val="18"/>
-              </w:rPr>
-              <w:t>Guide</w:t>
-            </w:r>
-          </w:p>
-          <w:p>
-            <w:pPr>
-              <w:spacing w:before="0" w:after="80"/>
-              <w:jc w:val="left"/>
-            </w:pPr>
-            <w:r>
-              <w:rPr>
-                <w:rFonts w:ascii="Arial" w:hAnsi="Arial" w:eastAsia="Arial" w:cs="Arial"/>
-                <w:b w:val="0"/>
-                <w:bCs w:val="0"/>
-                <w:i w:val="0"/>
-                <w:iCs w:val="0"/>
-                <w:color w:val="595959"/>
-                <w:sz w:val="17"/>
-                <w:szCs w:val="17"/>
-              </w:rPr>
-              <w:t>Measurable criteria for declaring the project a success. Vague criteria cause disputes — be specific with numbers. These feed directly into the UAT Sign-off ().</w:t>
-            </w:r>
-          </w:p>
-        </w:tc>
-      </w:tr>
-    </w:tbl>
     <w:p>
       <w:pPr>
         <w:spacing w:before="80" w:after="0"/>
@@ -6495,14 +5897,14 @@
           </w:tcPr>
           <w:p>
             <w:pPr>
-              <w:spacing w:before="0" w:after="0" w:line="240" w:lineRule="auto"/>
-            </w:pPr>
-            <w:r>
-              <w:rPr>
-                <w:rFonts w:ascii="Arial" w:hAnsi="Arial"/>
-                <w:b/>
-                <w:i w:val="0"/>
-                <w:sz w:val="18"/>
+              <w:spacing w:before="0" w:after="0" w:line="276" w:lineRule="auto"/>
+            </w:pPr>
+            <w:r>
+              <w:rPr>
+                <w:rFonts w:ascii="Calibri" w:hAnsi="Calibri"/>
+                <w:b/>
+                <w:i w:val="0"/>
+                <w:sz w:val="20"/>
               </w:rPr>
               <w:t>#</w:t>
             </w:r>
@@ -6528,14 +5930,14 @@
           </w:tcPr>
           <w:p>
             <w:pPr>
-              <w:spacing w:before="0" w:after="0" w:line="240" w:lineRule="auto"/>
-            </w:pPr>
-            <w:r>
-              <w:rPr>
-                <w:rFonts w:ascii="Arial" w:hAnsi="Arial"/>
-                <w:b/>
-                <w:i w:val="0"/>
-                <w:sz w:val="18"/>
+              <w:spacing w:before="0" w:after="0" w:line="276" w:lineRule="auto"/>
+            </w:pPr>
+            <w:r>
+              <w:rPr>
+                <w:rFonts w:ascii="Calibri" w:hAnsi="Calibri"/>
+                <w:b/>
+                <w:i w:val="0"/>
+                <w:sz w:val="20"/>
               </w:rPr>
               <w:t>Criterion</w:t>
             </w:r>
@@ -6561,14 +5963,14 @@
           </w:tcPr>
           <w:p>
             <w:pPr>
-              <w:spacing w:before="0" w:after="0" w:line="240" w:lineRule="auto"/>
-            </w:pPr>
-            <w:r>
-              <w:rPr>
-                <w:rFonts w:ascii="Arial" w:hAnsi="Arial"/>
-                <w:b/>
-                <w:i w:val="0"/>
-                <w:sz w:val="18"/>
+              <w:spacing w:before="0" w:after="0" w:line="276" w:lineRule="auto"/>
+            </w:pPr>
+            <w:r>
+              <w:rPr>
+                <w:rFonts w:ascii="Calibri" w:hAnsi="Calibri"/>
+                <w:b/>
+                <w:i w:val="0"/>
+                <w:sz w:val="20"/>
               </w:rPr>
               <w:t>Target</w:t>
             </w:r>
@@ -6594,14 +5996,14 @@
           </w:tcPr>
           <w:p>
             <w:pPr>
-              <w:spacing w:before="0" w:after="0" w:line="240" w:lineRule="auto"/>
-            </w:pPr>
-            <w:r>
-              <w:rPr>
-                <w:rFonts w:ascii="Arial" w:hAnsi="Arial"/>
-                <w:b/>
-                <w:i w:val="0"/>
-                <w:sz w:val="18"/>
+              <w:spacing w:before="0" w:after="0" w:line="276" w:lineRule="auto"/>
+            </w:pPr>
+            <w:r>
+              <w:rPr>
+                <w:rFonts w:ascii="Calibri" w:hAnsi="Calibri"/>
+                <w:b/>
+                <w:i w:val="0"/>
+                <w:sz w:val="20"/>
               </w:rPr>
               <w:t>Measurement</w:t>
             </w:r>
@@ -6645,14 +6047,14 @@
           </w:tcPr>
           <w:p>
             <w:pPr>
-              <w:spacing w:before="0" w:after="0" w:line="240" w:lineRule="auto"/>
-            </w:pPr>
-            <w:r>
-              <w:rPr>
-                <w:rFonts w:ascii="Arial" w:hAnsi="Arial"/>
+              <w:spacing w:before="0" w:after="0" w:line="276" w:lineRule="auto"/>
+            </w:pPr>
+            <w:r>
+              <w:rPr>
+                <w:rFonts w:ascii="Calibri" w:hAnsi="Calibri"/>
                 <w:b w:val="0"/>
                 <w:i w:val="0"/>
-                <w:sz w:val="18"/>
+                <w:sz w:val="20"/>
               </w:rPr>
               <w:t>1</w:t>
             </w:r>
@@ -6677,16 +6079,14 @@
           </w:tcPr>
           <w:p>
             <w:pPr>
-              <w:spacing w:before="0" w:after="0" w:line="240" w:lineRule="auto"/>
-            </w:pPr>
-            <w:r>
-              <w:rPr>
-                <w:rFonts w:ascii="Arial" w:hAnsi="Arial"/>
-                <w:b w:val="0"/>
-                <w:i w:val="0"/>
-                <w:sz w:val="17"/>
-              </w:rPr>
-              <w:t>All features pass User Acceptance Testing (UAT)</w:t>
+              <w:spacing w:line="276" w:lineRule="auto"/>
+            </w:pPr>
+            <w:r>
+              <w:rPr>
+                <w:rFonts w:ascii="Calibri" w:hAnsi="Calibri"/>
+                <w:sz w:val="20"/>
+              </w:rPr>
+              <w:t>Benchmark Evaluation Pass Rate</w:t>
             </w:r>
           </w:p>
         </w:tc>
@@ -6709,16 +6109,14 @@
           </w:tcPr>
           <w:p>
             <w:pPr>
-              <w:spacing w:before="0" w:after="0" w:line="240" w:lineRule="auto"/>
-            </w:pPr>
-            <w:r>
-              <w:rPr>
-                <w:rFonts w:ascii="Arial" w:hAnsi="Arial"/>
-                <w:b/>
-                <w:i w:val="0"/>
-                <w:sz w:val="17"/>
-              </w:rPr>
-              <w:t>100% pass rate</w:t>
+              <w:spacing w:line="276" w:lineRule="auto"/>
+            </w:pPr>
+            <w:r>
+              <w:rPr>
+                <w:rFonts w:ascii="Calibri" w:hAnsi="Calibri"/>
+                <w:sz w:val="20"/>
+              </w:rPr>
+              <w:t>100% of defined prototype test scenarios executed with zero blocking defects</w:t>
             </w:r>
           </w:p>
         </w:tc>
@@ -6741,16 +6139,14 @@
           </w:tcPr>
           <w:p>
             <w:pPr>
-              <w:spacing w:before="0" w:after="0" w:line="240" w:lineRule="auto"/>
-            </w:pPr>
-            <w:r>
-              <w:rPr>
-                <w:rFonts w:ascii="Arial" w:hAnsi="Arial"/>
-                <w:b w:val="0"/>
-                <w:i w:val="0"/>
-                <w:sz w:val="16"/>
-              </w:rPr>
-              <w:t>UAT Sign-off</w:t>
+              <w:spacing w:line="276" w:lineRule="auto"/>
+            </w:pPr>
+            <w:r>
+              <w:rPr>
+                <w:rFonts w:ascii="Calibri" w:hAnsi="Calibri"/>
+                <w:sz w:val="20"/>
+              </w:rPr>
+              <w:t>Quality Verification Report</w:t>
             </w:r>
           </w:p>
         </w:tc>
@@ -6792,14 +6188,14 @@
           </w:tcPr>
           <w:p>
             <w:pPr>
-              <w:spacing w:before="0" w:after="0" w:line="240" w:lineRule="auto"/>
-            </w:pPr>
-            <w:r>
-              <w:rPr>
-                <w:rFonts w:ascii="Arial" w:hAnsi="Arial"/>
+              <w:spacing w:before="0" w:after="0" w:line="276" w:lineRule="auto"/>
+            </w:pPr>
+            <w:r>
+              <w:rPr>
+                <w:rFonts w:ascii="Calibri" w:hAnsi="Calibri"/>
                 <w:b w:val="0"/>
                 <w:i w:val="0"/>
-                <w:sz w:val="18"/>
+                <w:sz w:val="20"/>
               </w:rPr>
               <w:t>2</w:t>
             </w:r>
@@ -6824,16 +6220,14 @@
           </w:tcPr>
           <w:p>
             <w:pPr>
-              <w:spacing w:before="0" w:after="0" w:line="240" w:lineRule="auto"/>
-            </w:pPr>
-            <w:r>
-              <w:rPr>
-                <w:rFonts w:ascii="Arial" w:hAnsi="Arial"/>
-                <w:b w:val="0"/>
-                <w:i w:val="0"/>
-                <w:sz w:val="17"/>
-              </w:rPr>
-              <w:t>Enterprise security baseline at release</w:t>
+              <w:spacing w:line="276" w:lineRule="auto"/>
+            </w:pPr>
+            <w:r>
+              <w:rPr>
+                <w:rFonts w:ascii="Calibri" w:hAnsi="Calibri"/>
+                <w:sz w:val="20"/>
+              </w:rPr>
+              <w:t>Enterprise Security &amp; Isolation Baseline</w:t>
             </w:r>
           </w:p>
         </w:tc>
@@ -6856,16 +6250,14 @@
           </w:tcPr>
           <w:p>
             <w:pPr>
-              <w:spacing w:before="0" w:after="0" w:line="240" w:lineRule="auto"/>
-            </w:pPr>
-            <w:r>
-              <w:rPr>
-                <w:rFonts w:ascii="Arial" w:hAnsi="Arial"/>
-                <w:b/>
-                <w:i w:val="0"/>
-                <w:sz w:val="17"/>
-              </w:rPr>
-              <w:t>All services authenticated; 0 Critical vulnerabilities</w:t>
+              <w:spacing w:line="276" w:lineRule="auto"/>
+            </w:pPr>
+            <w:r>
+              <w:rPr>
+                <w:rFonts w:ascii="Calibri" w:hAnsi="Calibri"/>
+                <w:sz w:val="20"/>
+              </w:rPr>
+              <w:t>All core REST endpoints authenticated; 0 Critical vulnerabilities; 100% tenant data separation verified</w:t>
             </w:r>
           </w:p>
         </w:tc>
@@ -6888,14 +6280,12 @@
           </w:tcPr>
           <w:p>
             <w:pPr>
-              <w:spacing w:before="0" w:after="0" w:line="240" w:lineRule="auto"/>
-            </w:pPr>
-            <w:r>
-              <w:rPr>
-                <w:rFonts w:ascii="Arial" w:hAnsi="Arial"/>
-                <w:b w:val="0"/>
-                <w:i w:val="0"/>
-                <w:sz w:val="16"/>
+              <w:spacing w:line="276" w:lineRule="auto"/>
+            </w:pPr>
+            <w:r>
+              <w:rPr>
+                <w:rFonts w:ascii="Calibri" w:hAnsi="Calibri"/>
+                <w:sz w:val="20"/>
               </w:rPr>
               <w:t>Security Test Report</w:t>
             </w:r>
@@ -6939,14 +6329,14 @@
           </w:tcPr>
           <w:p>
             <w:pPr>
-              <w:spacing w:before="0" w:after="0" w:line="240" w:lineRule="auto"/>
-            </w:pPr>
-            <w:r>
-              <w:rPr>
-                <w:rFonts w:ascii="Arial" w:hAnsi="Arial"/>
+              <w:spacing w:before="0" w:after="0" w:line="276" w:lineRule="auto"/>
+            </w:pPr>
+            <w:r>
+              <w:rPr>
+                <w:rFonts w:ascii="Calibri" w:hAnsi="Calibri"/>
                 <w:b w:val="0"/>
                 <w:i w:val="0"/>
-                <w:sz w:val="18"/>
+                <w:sz w:val="20"/>
               </w:rPr>
               <w:t>3</w:t>
             </w:r>
@@ -6971,16 +6361,14 @@
           </w:tcPr>
           <w:p>
             <w:pPr>
-              <w:spacing w:before="0" w:after="0" w:line="240" w:lineRule="auto"/>
-            </w:pPr>
-            <w:r>
-              <w:rPr>
-                <w:rFonts w:ascii="Arial" w:hAnsi="Arial"/>
-                <w:b w:val="0"/>
-                <w:i w:val="0"/>
-                <w:sz w:val="17"/>
-              </w:rPr>
-              <w:t>A new business domain is onboarded through configuration</w:t>
+              <w:spacing w:line="276" w:lineRule="auto"/>
+            </w:pPr>
+            <w:r>
+              <w:rPr>
+                <w:rFonts w:ascii="Calibri" w:hAnsi="Calibri"/>
+                <w:sz w:val="20"/>
+              </w:rPr>
+              <w:t>Configurable Domain Onboarding</w:t>
             </w:r>
           </w:p>
         </w:tc>
@@ -7003,16 +6391,14 @@
           </w:tcPr>
           <w:p>
             <w:pPr>
-              <w:spacing w:before="0" w:after="0" w:line="240" w:lineRule="auto"/>
-            </w:pPr>
-            <w:r>
-              <w:rPr>
-                <w:rFonts w:ascii="Arial" w:hAnsi="Arial"/>
-                <w:b/>
-                <w:i w:val="0"/>
-                <w:sz w:val="17"/>
-              </w:rPr>
-              <w:t>No changes to core service code</w:t>
+              <w:spacing w:line="276" w:lineRule="auto"/>
+            </w:pPr>
+            <w:r>
+              <w:rPr>
+                <w:rFonts w:ascii="Calibri" w:hAnsi="Calibri"/>
+                <w:sz w:val="20"/>
+              </w:rPr>
+              <w:t>New business domain onboarded purely via configuration with 0 core service code modifications</w:t>
             </w:r>
           </w:p>
         </w:tc>
@@ -7035,16 +6421,14 @@
           </w:tcPr>
           <w:p>
             <w:pPr>
-              <w:spacing w:before="0" w:after="0" w:line="240" w:lineRule="auto"/>
-            </w:pPr>
-            <w:r>
-              <w:rPr>
-                <w:rFonts w:ascii="Arial" w:hAnsi="Arial"/>
-                <w:b w:val="0"/>
-                <w:i w:val="0"/>
-                <w:sz w:val="16"/>
-              </w:rPr>
-              <w:t>Demonstration and code review</w:t>
+              <w:spacing w:line="276" w:lineRule="auto"/>
+            </w:pPr>
+            <w:r>
+              <w:rPr>
+                <w:rFonts w:ascii="Calibri" w:hAnsi="Calibri"/>
+                <w:sz w:val="20"/>
+              </w:rPr>
+              <w:t>Demonstration and Code Review</w:t>
             </w:r>
           </w:p>
         </w:tc>
@@ -7086,14 +6470,14 @@
           </w:tcPr>
           <w:p>
             <w:pPr>
-              <w:spacing w:before="0" w:after="0" w:line="240" w:lineRule="auto"/>
-            </w:pPr>
-            <w:r>
-              <w:rPr>
-                <w:rFonts w:ascii="Arial" w:hAnsi="Arial"/>
+              <w:spacing w:before="0" w:after="0" w:line="276" w:lineRule="auto"/>
+            </w:pPr>
+            <w:r>
+              <w:rPr>
+                <w:rFonts w:ascii="Calibri" w:hAnsi="Calibri"/>
                 <w:b w:val="0"/>
                 <w:i w:val="0"/>
-                <w:sz w:val="18"/>
+                <w:sz w:val="20"/>
               </w:rPr>
               <w:t>4</w:t>
             </w:r>
@@ -7118,16 +6502,14 @@
           </w:tcPr>
           <w:p>
             <w:pPr>
-              <w:spacing w:before="0" w:after="0" w:line="240" w:lineRule="auto"/>
-            </w:pPr>
-            <w:r>
-              <w:rPr>
-                <w:rFonts w:ascii="Arial" w:hAnsi="Arial"/>
-                <w:b w:val="0"/>
-                <w:i w:val="0"/>
-                <w:sz w:val="17"/>
-              </w:rPr>
-              <w:t>Related documents are linked across time</w:t>
+              <w:spacing w:line="276" w:lineRule="auto"/>
+            </w:pPr>
+            <w:r>
+              <w:rPr>
+                <w:rFonts w:ascii="Calibri" w:hAnsi="Calibri"/>
+                <w:sz w:val="20"/>
+              </w:rPr>
+              <w:t>Cross-Document Relationship Linking</w:t>
             </w:r>
           </w:p>
         </w:tc>
@@ -7150,16 +6532,14 @@
           </w:tcPr>
           <w:p>
             <w:pPr>
-              <w:spacing w:before="0" w:after="0" w:line="240" w:lineRule="auto"/>
-            </w:pPr>
-            <w:r>
-              <w:rPr>
-                <w:rFonts w:ascii="Arial" w:hAnsi="Arial"/>
-                <w:b/>
-                <w:i w:val="0"/>
-                <w:sz w:val="17"/>
-              </w:rPr>
-              <w:t>≥ 85% precision on evaluation dataset</w:t>
+              <w:spacing w:line="276" w:lineRule="auto"/>
+            </w:pPr>
+            <w:r>
+              <w:rPr>
+                <w:rFonts w:ascii="Calibri" w:hAnsi="Calibri"/>
+                <w:sz w:val="20"/>
+              </w:rPr>
+              <w:t>≥ 85% precision and ≥ 75% recall across a standardized 50-pair cross-temporal evaluation dataset</w:t>
             </w:r>
           </w:p>
         </w:tc>
@@ -7182,16 +6562,84 @@
           </w:tcPr>
           <w:p>
             <w:pPr>
-              <w:spacing w:before="0" w:after="0" w:line="240" w:lineRule="auto"/>
-            </w:pPr>
-            <w:r>
-              <w:rPr>
-                <w:rFonts w:ascii="Arial" w:hAnsi="Arial"/>
-                <w:b w:val="0"/>
-                <w:i w:val="0"/>
-                <w:sz w:val="16"/>
-              </w:rPr>
-              <w:t>Evaluation Report</w:t>
+              <w:spacing w:line="276" w:lineRule="auto"/>
+            </w:pPr>
+            <w:r>
+              <w:rPr>
+                <w:rFonts w:ascii="Calibri" w:hAnsi="Calibri"/>
+                <w:sz w:val="20"/>
+              </w:rPr>
+              <w:t>Evaluation Benchmark Report</w:t>
+            </w:r>
+          </w:p>
+        </w:tc>
+      </w:tr>
+      <w:tr>
+        <w:tc>
+          <w:tcPr>
+            <w:tcW w:type="dxa" w:w="400"/>
+          </w:tcPr>
+          <w:p>
+            <w:pPr>
+              <w:spacing w:line="276" w:lineRule="auto"/>
+            </w:pPr>
+            <w:r>
+              <w:rPr>
+                <w:rFonts w:ascii="Calibri" w:hAnsi="Calibri"/>
+                <w:sz w:val="20"/>
+              </w:rPr>
+              <w:t>5</w:t>
+            </w:r>
+          </w:p>
+        </w:tc>
+        <w:tc>
+          <w:tcPr>
+            <w:tcW w:type="dxa" w:w="3800"/>
+          </w:tcPr>
+          <w:p>
+            <w:pPr>
+              <w:spacing w:line="276" w:lineRule="auto"/>
+            </w:pPr>
+            <w:r>
+              <w:rPr>
+                <w:rFonts w:ascii="Calibri" w:hAnsi="Calibri"/>
+                <w:sz w:val="20"/>
+              </w:rPr>
+              <w:t>Effort &amp; Budget Compliance</w:t>
+            </w:r>
+          </w:p>
+        </w:tc>
+        <w:tc>
+          <w:tcPr>
+            <w:tcW w:type="dxa" w:w="2000"/>
+          </w:tcPr>
+          <w:p>
+            <w:pPr>
+              <w:spacing w:line="276" w:lineRule="auto"/>
+            </w:pPr>
+            <w:r>
+              <w:rPr>
+                <w:rFonts w:ascii="Calibri" w:hAnsi="Calibri"/>
+                <w:sz w:val="20"/>
+              </w:rPr>
+              <w:t>Delivery completed within ≤ 80 person-hours and ≤ ¥27,500 direct expenditure</w:t>
+            </w:r>
+          </w:p>
+        </w:tc>
+        <w:tc>
+          <w:tcPr>
+            <w:tcW w:type="dxa" w:w="2826"/>
+          </w:tcPr>
+          <w:p>
+            <w:pPr>
+              <w:spacing w:line="276" w:lineRule="auto"/>
+            </w:pPr>
+            <w:r>
+              <w:rPr>
+                <w:rFonts w:ascii="Calibri" w:hAnsi="Calibri"/>
+                <w:sz w:val="20"/>
+              </w:rPr>
+              <w:t>Project Closure &amp; Accounting Report</w:t>
             </w:r>
           </w:p>
         </w:tc>
@@ -7870,27 +7318,6 @@
         </w:tc>
       </w:tr>
     </w:tbl>
-    <w:p>
-      <w:pPr>
-        <w:spacing w:before="0" w:after="80"/>
-        <w:jc w:val="left"/>
-      </w:pPr>
-      <w:bookmarkStart w:id="0" w:name="_GoBack"/>
-      <w:bookmarkEnd w:id="0"/>
-      <w:r>
-        <w:rPr>
-          <w:rFonts w:ascii="Arial" w:hAnsi="Arial" w:eastAsia="Arial" w:cs="Arial"/>
-          <w:b w:val="0"/>
-          <w:bCs w:val="0"/>
-          <w:i w:val="0"/>
-          <w:iCs w:val="0"/>
-          <w:color w:val="A32D2D"/>
-          <w:sz w:val="17"/>
-          <w:szCs w:val="17"/>
-        </w:rPr>
-        <w:t>cy against your actual project details.</w:t>
-      </w:r>
-    </w:p>
     <w:sectPr>
       <w:headerReference r:id="rId3" w:type="default"/>
       <w:footerReference r:id="rId4" w:type="default"/>

</xml_diff>

<commit_message>
docs: update Subteam 2 allocation to Option B (80h per member, 240h total)
</commit_message>
<xml_diff>
--- a/docs/Project_Charter_Subteam_2.docx
+++ b/docs/Project_Charter_Subteam_2.docx
@@ -32,7 +32,7 @@
         <w:jc w:val="center"/>
       </w:pPr>
       <w:r>
-        <w:t xml:space="preserve">  ·  Version 1.1  ·  Third Wave Inc.</w:t>
+        <w:t xml:space="preserve">  ·  Version 1.2  ·  Third Wave Inc.</w:t>
       </w:r>
     </w:p>
     <w:p>
@@ -537,7 +537,7 @@
           </w:tcPr>
           <w:p>
             <w:r>
-              <w:t>1.1</w:t>
+              <w:t>1.2</w:t>
             </w:r>
           </w:p>
         </w:tc>
@@ -1119,7 +1119,7 @@
           </w:tcPr>
           <w:p>
             <w:r>
-              <w:t>1.1</w:t>
+              <w:t>1.2</w:t>
             </w:r>
           </w:p>
         </w:tc>
@@ -1191,7 +1191,7 @@
           </w:tcPr>
           <w:p>
             <w:r>
-              <w:t>Rescoped for Alternative B (Action Runtime architecture) &amp; dual-prototype evaluation</w:t>
+              <w:t>Updated effort allocation to 80h per member (240 person-hours total) &amp; refined schedule</w:t>
             </w:r>
           </w:p>
         </w:tc>
@@ -1412,7 +1412,7 @@
                 <w:rFonts w:ascii="Calibri" w:hAnsi="Calibri"/>
                 <w:sz w:val="20"/>
               </w:rPr>
-              <w:t>LOGOS was originally developed as a single-purpose assistant for Dospara customer-support drafting with hardcoded business logic and no runtime ontology enforcement. To achieve an enterprise-grade transformation within an 80 person-hour allocation, Third Wave is testing two distinct alternatives: Subteam 1 explores an interface-led/workbench transformation (Alternative A), while Subteam 2 explores a decoupled, action-centric runtime with non-invasive epistemic memory (Alternative B) to evaluate which approach delivers superior enterprise utility, lower integration complexity, and deterministic domain execution.</w:t>
+              <w:t>LOGOS was originally developed as a single-purpose assistant for Dospara customer-support drafting with hardcoded business logic and no runtime ontology enforcement. To achieve an enterprise-grade transformation, Third Wave is testing two distinct alternatives with 80 hours allocated per member (240 person-hours total per team): Subteam 1 explores an interface-led/workbench transformation (Alternative A), while Subteam 2 explores a decoupled, action-centric runtime with non-invasive epistemic memory (Alternative B) to evaluate which approach delivers superior enterprise utility, lower integration complexity, and deterministic domain execution.</w:t>
             </w:r>
           </w:p>
         </w:tc>
@@ -2368,7 +2368,7 @@
                 <w:rFonts w:ascii="Calibri" w:hAnsi="Calibri"/>
                 <w:sz w:val="20"/>
               </w:rPr>
-              <w:t>Strictly capped at 80 person-hours across a 3-member team (Pooja: 30h, Jaiadithya: 30h, Balachandra: 20h).</w:t>
+              <w:t>Allocated at 80 hours per person across a 3-member team (Pooja: 80h, Jaiadithya: 80h, Balachandra: 80h — 240 person-hours total).</w:t>
             </w:r>
           </w:p>
           <w:p>
@@ -2397,7 +2397,7 @@
                 <w:rFonts w:ascii="Calibri" w:hAnsi="Calibri"/>
                 <w:sz w:val="20"/>
               </w:rPr>
-              <w:t>Direct non-labor expenditure capped at ¥27,500 (excluding tax); internal labor at ¥0.</w:t>
+              <w:t>Direct non-labor expenditure capped at ¥27,500 (excluding tax); internal engineering labor at ¥0.</w:t>
             </w:r>
           </w:p>
           <w:p>
@@ -2426,7 +2426,7 @@
                 <w:rFonts w:ascii="Calibri" w:hAnsi="Calibri"/>
                 <w:sz w:val="20"/>
               </w:rPr>
-              <w:t>8 calendar weeks (19 October 2026 – 11 December 2026).</w:t>
+              <w:t>9 calendar weeks (19 October 2026 – 18 December 2026, ~8.8 hours per person per week).</w:t>
             </w:r>
           </w:p>
           <w:p>
@@ -2560,14 +2560,15 @@
           </w:tcPr>
           <w:p>
             <w:pPr>
-              <w:spacing w:after="80"/>
-            </w:pPr>
-            <w:r>
-              <w:rPr>
+              <w:spacing w:after="80" w:line="276" w:lineRule="auto"/>
+            </w:pPr>
+            <w:r>
+              <w:rPr>
+                <w:rFonts w:ascii="Calibri" w:hAnsi="Calibri"/>
                 <w:b/>
                 <w:bCs/>
                 <w:color w:val="FFFFFF"/>
-                <w:sz w:val="18"/>
+                <w:sz w:val="20"/>
                 <w:szCs w:val="18"/>
               </w:rPr>
               <w:t>Phase</w:t>
@@ -2594,14 +2595,15 @@
           </w:tcPr>
           <w:p>
             <w:pPr>
-              <w:spacing w:after="80"/>
-            </w:pPr>
-            <w:r>
-              <w:rPr>
+              <w:spacing w:after="80" w:line="276" w:lineRule="auto"/>
+            </w:pPr>
+            <w:r>
+              <w:rPr>
+                <w:rFonts w:ascii="Calibri" w:hAnsi="Calibri"/>
                 <w:b/>
                 <w:bCs/>
                 <w:color w:val="FFFFFF"/>
-                <w:sz w:val="18"/>
+                <w:sz w:val="20"/>
                 <w:szCs w:val="18"/>
               </w:rPr>
               <w:t>Owner(s)</w:t>
@@ -2628,14 +2630,15 @@
           </w:tcPr>
           <w:p>
             <w:pPr>
-              <w:spacing w:after="80"/>
-            </w:pPr>
-            <w:r>
-              <w:rPr>
+              <w:spacing w:after="80" w:line="276" w:lineRule="auto"/>
+            </w:pPr>
+            <w:r>
+              <w:rPr>
+                <w:rFonts w:ascii="Calibri" w:hAnsi="Calibri"/>
                 <w:b/>
                 <w:bCs/>
                 <w:color w:val="FFFFFF"/>
-                <w:sz w:val="18"/>
+                <w:sz w:val="20"/>
                 <w:szCs w:val="18"/>
               </w:rPr>
               <w:t>Effort (person-hours)</w:t>
@@ -2662,14 +2665,15 @@
           </w:tcPr>
           <w:p>
             <w:pPr>
-              <w:spacing w:after="80"/>
-            </w:pPr>
-            <w:r>
-              <w:rPr>
+              <w:spacing w:after="80" w:line="276" w:lineRule="auto"/>
+            </w:pPr>
+            <w:r>
+              <w:rPr>
+                <w:rFonts w:ascii="Calibri" w:hAnsi="Calibri"/>
                 <w:b/>
                 <w:bCs/>
                 <w:color w:val="FFFFFF"/>
-                <w:sz w:val="18"/>
+                <w:sz w:val="20"/>
                 <w:szCs w:val="18"/>
               </w:rPr>
               <w:t>Key Deliverables</w:t>
@@ -2715,10 +2719,17 @@
             </w:tcMar>
           </w:tcPr>
           <w:p>
-            <w:r>
+            <w:pPr>
+              <w:spacing w:line="276" w:lineRule="auto"/>
+            </w:pPr>
+            <w:r>
+              <w:rPr>
+                <w:rFonts w:ascii="Calibri" w:hAnsi="Calibri"/>
+                <w:sz w:val="20"/>
+              </w:rPr>
               <w:t>Phase 1: Architectural Design &amp; Benchmark Setup</w:t>
               <w:br/>
-              <w:t>(2026-10-19 – 2026-10-23)</w:t>
+              <w:t>(2026-10-19 – 2026-10-30)</w:t>
             </w:r>
           </w:p>
         </w:tc>
@@ -2741,12 +2752,19 @@
             <w:vAlign w:val="center"/>
           </w:tcPr>
           <w:p>
-            <w:r>
-              <w:t>Pooja (4h)</w:t>
+            <w:pPr>
+              <w:spacing w:line="276" w:lineRule="auto"/>
+            </w:pPr>
+            <w:r>
+              <w:rPr>
+                <w:rFonts w:ascii="Calibri" w:hAnsi="Calibri"/>
+                <w:sz w:val="20"/>
+              </w:rPr>
+              <w:t>Pooja (12h)</w:t>
               <w:br/>
-              <w:t>Jaiadithya (4h)</w:t>
+              <w:t>Jaiadithya (10h)</w:t>
               <w:br/>
-              <w:t>Balachandra (2h)</w:t>
+              <w:t>Balachandra (8h)</w:t>
             </w:r>
           </w:p>
         </w:tc>
@@ -2769,8 +2787,15 @@
             <w:vAlign w:val="center"/>
           </w:tcPr>
           <w:p>
-            <w:r>
-              <w:t>10</w:t>
+            <w:pPr>
+              <w:spacing w:line="276" w:lineRule="auto"/>
+            </w:pPr>
+            <w:r>
+              <w:rPr>
+                <w:rFonts w:ascii="Calibri" w:hAnsi="Calibri"/>
+                <w:sz w:val="20"/>
+              </w:rPr>
+              <w:t>30</w:t>
             </w:r>
           </w:p>
         </w:tc>
@@ -2792,7 +2817,14 @@
             </w:tcMar>
           </w:tcPr>
           <w:p>
-            <w:r>
+            <w:pPr>
+              <w:spacing w:line="276" w:lineRule="auto"/>
+            </w:pPr>
+            <w:r>
+              <w:rPr>
+                <w:rFonts w:ascii="Calibri" w:hAnsi="Calibri"/>
+                <w:sz w:val="20"/>
+              </w:rPr>
               <w:t>Alternative B architectural specification, domain-pack schema design, comparative evaluation benchmark criteria, environment setup.</w:t>
             </w:r>
           </w:p>
@@ -2836,10 +2868,17 @@
             </w:tcMar>
           </w:tcPr>
           <w:p>
-            <w:r>
+            <w:pPr>
+              <w:spacing w:line="276" w:lineRule="auto"/>
+            </w:pPr>
+            <w:r>
+              <w:rPr>
+                <w:rFonts w:ascii="Calibri" w:hAnsi="Calibri"/>
+                <w:sz w:val="20"/>
+              </w:rPr>
               <w:t>Phase 2: Development – Core Action Runtime &amp; Epistemic Layer</w:t>
               <w:br/>
-              <w:t>(2026-10-26 – 2026-11-06)</w:t>
+              <w:t>(2026-11-02 – 2026-11-13)</w:t>
             </w:r>
           </w:p>
         </w:tc>
@@ -2862,10 +2901,19 @@
             <w:vAlign w:val="center"/>
           </w:tcPr>
           <w:p>
-            <w:r>
-              <w:t>Pooja (9h)</w:t>
+            <w:pPr>
+              <w:spacing w:line="276" w:lineRule="auto"/>
+            </w:pPr>
+            <w:r>
+              <w:rPr>
+                <w:rFonts w:ascii="Calibri" w:hAnsi="Calibri"/>
+                <w:sz w:val="20"/>
+              </w:rPr>
+              <w:t>Pooja (25h)</w:t>
               <w:br/>
-              <w:t>Jaiadithya (13h)</w:t>
+              <w:t>Jaiadithya (35h)</w:t>
+              <w:br/>
+              <w:t>Balachandra (5h)</w:t>
             </w:r>
           </w:p>
         </w:tc>
@@ -2888,8 +2936,15 @@
             <w:vAlign w:val="center"/>
           </w:tcPr>
           <w:p>
-            <w:r>
-              <w:t>22</w:t>
+            <w:pPr>
+              <w:spacing w:line="276" w:lineRule="auto"/>
+            </w:pPr>
+            <w:r>
+              <w:rPr>
+                <w:rFonts w:ascii="Calibri" w:hAnsi="Calibri"/>
+                <w:sz w:val="20"/>
+              </w:rPr>
+              <w:t>65</w:t>
             </w:r>
           </w:p>
         </w:tc>
@@ -2911,7 +2966,14 @@
             </w:tcMar>
           </w:tcPr>
           <w:p>
-            <w:r>
+            <w:pPr>
+              <w:spacing w:line="276" w:lineRule="auto"/>
+            </w:pPr>
+            <w:r>
+              <w:rPr>
+                <w:rFonts w:ascii="Calibri" w:hAnsi="Calibri"/>
+                <w:sz w:val="20"/>
+              </w:rPr>
               <w:t>Ontology state-machine engine, action validation rules, application-level epistemic memory and audit event store (respecting zero-DB migration constraint).</w:t>
             </w:r>
           </w:p>
@@ -2955,10 +3017,17 @@
             </w:tcMar>
           </w:tcPr>
           <w:p>
-            <w:r>
+            <w:pPr>
+              <w:spacing w:line="276" w:lineRule="auto"/>
+            </w:pPr>
+            <w:r>
+              <w:rPr>
+                <w:rFonts w:ascii="Calibri" w:hAnsi="Calibri"/>
+                <w:sz w:val="20"/>
+              </w:rPr>
               <w:t>Phase 3: Development – Ingestion, Retrieval &amp; API Integration</w:t>
               <w:br/>
-              <w:t>(2026-11-09 – 2026-11-20)</w:t>
+              <w:t>(2026-11-16 – 2026-11-27)</w:t>
             </w:r>
           </w:p>
         </w:tc>
@@ -2981,10 +3050,19 @@
             <w:vAlign w:val="center"/>
           </w:tcPr>
           <w:p>
-            <w:r>
-              <w:t>Pooja (11h)</w:t>
+            <w:pPr>
+              <w:spacing w:line="276" w:lineRule="auto"/>
+            </w:pPr>
+            <w:r>
+              <w:rPr>
+                <w:rFonts w:ascii="Calibri" w:hAnsi="Calibri"/>
+                <w:sz w:val="20"/>
+              </w:rPr>
+              <w:t>Pooja (25h)</w:t>
               <w:br/>
-              <w:t>Jaiadithya (11h)</w:t>
+              <w:t>Jaiadithya (30h)</w:t>
+              <w:br/>
+              <w:t>Balachandra (10h)</w:t>
             </w:r>
           </w:p>
         </w:tc>
@@ -3007,8 +3085,15 @@
             <w:vAlign w:val="center"/>
           </w:tcPr>
           <w:p>
-            <w:r>
-              <w:t>22</w:t>
+            <w:pPr>
+              <w:spacing w:line="276" w:lineRule="auto"/>
+            </w:pPr>
+            <w:r>
+              <w:rPr>
+                <w:rFonts w:ascii="Calibri" w:hAnsi="Calibri"/>
+                <w:sz w:val="20"/>
+              </w:rPr>
+              <w:t>65</w:t>
             </w:r>
           </w:p>
         </w:tc>
@@ -3030,7 +3115,14 @@
             </w:tcMar>
           </w:tcPr>
           <w:p>
-            <w:r>
+            <w:pPr>
+              <w:spacing w:line="276" w:lineRule="auto"/>
+            </w:pPr>
+            <w:r>
+              <w:rPr>
+                <w:rFonts w:ascii="Calibri" w:hAnsi="Calibri"/>
+                <w:sz w:val="20"/>
+              </w:rPr>
               <w:t>Declarative domain pack loader, cross-document relationship detection pipeline, REST API endpoints for queries and benchmark evaluation.</w:t>
             </w:r>
           </w:p>
@@ -3074,10 +3166,17 @@
             </w:tcMar>
           </w:tcPr>
           <w:p>
-            <w:r>
+            <w:pPr>
+              <w:spacing w:line="276" w:lineRule="auto"/>
+            </w:pPr>
+            <w:r>
+              <w:rPr>
+                <w:rFonts w:ascii="Calibri" w:hAnsi="Calibri"/>
+                <w:sz w:val="20"/>
+              </w:rPr>
               <w:t>Phase 4: Comparative Evaluation, Quality &amp; Security Validation</w:t>
               <w:br/>
-              <w:t>(2026-11-23 – 2026-12-04)</w:t>
+              <w:t>(2026-11-30 – 2026-12-11)</w:t>
             </w:r>
           </w:p>
         </w:tc>
@@ -3100,12 +3199,19 @@
             <w:vAlign w:val="center"/>
           </w:tcPr>
           <w:p>
-            <w:r>
-              <w:t>Balachandra (17h)</w:t>
+            <w:pPr>
+              <w:spacing w:line="276" w:lineRule="auto"/>
+            </w:pPr>
+            <w:r>
+              <w:rPr>
+                <w:rFonts w:ascii="Calibri" w:hAnsi="Calibri"/>
+                <w:sz w:val="20"/>
+              </w:rPr>
+              <w:t>Balachandra (50h)</w:t>
               <w:br/>
-              <w:t>Jaiadithya (1h)</w:t>
+              <w:t>Jaiadithya (5h)</w:t>
               <w:br/>
-              <w:t>Pooja (2h)</w:t>
+              <w:t>Pooja (5h)</w:t>
             </w:r>
           </w:p>
         </w:tc>
@@ -3128,8 +3234,15 @@
             <w:vAlign w:val="center"/>
           </w:tcPr>
           <w:p>
-            <w:r>
-              <w:t>20</w:t>
+            <w:pPr>
+              <w:spacing w:line="276" w:lineRule="auto"/>
+            </w:pPr>
+            <w:r>
+              <w:rPr>
+                <w:rFonts w:ascii="Calibri" w:hAnsi="Calibri"/>
+                <w:sz w:val="20"/>
+              </w:rPr>
+              <w:t>60</w:t>
             </w:r>
           </w:p>
         </w:tc>
@@ -3151,7 +3264,14 @@
             </w:tcMar>
           </w:tcPr>
           <w:p>
-            <w:r>
+            <w:pPr>
+              <w:spacing w:line="276" w:lineRule="auto"/>
+            </w:pPr>
+            <w:r>
+              <w:rPr>
+                <w:rFonts w:ascii="Calibri" w:hAnsi="Calibri"/>
+                <w:sz w:val="20"/>
+              </w:rPr>
               <w:t>Execution of standardized evaluation benchmark, precision/recall verification, tenant isolation testing, security assessment report.</w:t>
             </w:r>
           </w:p>
@@ -3195,10 +3315,17 @@
             </w:tcMar>
           </w:tcPr>
           <w:p>
-            <w:r>
+            <w:pPr>
+              <w:spacing w:line="276" w:lineRule="auto"/>
+            </w:pPr>
+            <w:r>
+              <w:rPr>
+                <w:rFonts w:ascii="Calibri" w:hAnsi="Calibri"/>
+                <w:sz w:val="20"/>
+              </w:rPr>
               <w:t>Phase 5: Release, Alternative Comparison &amp; Handover</w:t>
               <w:br/>
-              <w:t>(2026-12-07 – 2026-12-11)</w:t>
+              <w:t>(2026-12-14 – 2026-12-18)</w:t>
             </w:r>
           </w:p>
         </w:tc>
@@ -3221,12 +3348,19 @@
             <w:vAlign w:val="center"/>
           </w:tcPr>
           <w:p>
-            <w:r>
-              <w:t>Pooja (4h)</w:t>
+            <w:pPr>
+              <w:spacing w:line="276" w:lineRule="auto"/>
+            </w:pPr>
+            <w:r>
+              <w:rPr>
+                <w:rFonts w:ascii="Calibri" w:hAnsi="Calibri"/>
+                <w:sz w:val="20"/>
+              </w:rPr>
+              <w:t>Pooja (14h)</w:t>
               <w:br/>
-              <w:t>Jaiadithya (1h)</w:t>
+              <w:t>Jaiadithya (3h)</w:t>
               <w:br/>
-              <w:t>Balachandra (1h)</w:t>
+              <w:t>Balachandra (3h)</w:t>
             </w:r>
           </w:p>
         </w:tc>
@@ -3249,8 +3383,15 @@
             <w:vAlign w:val="center"/>
           </w:tcPr>
           <w:p>
-            <w:r>
-              <w:t>6</w:t>
+            <w:pPr>
+              <w:spacing w:line="276" w:lineRule="auto"/>
+            </w:pPr>
+            <w:r>
+              <w:rPr>
+                <w:rFonts w:ascii="Calibri" w:hAnsi="Calibri"/>
+                <w:sz w:val="20"/>
+              </w:rPr>
+              <w:t>20</w:t>
             </w:r>
           </w:p>
         </w:tc>
@@ -3272,7 +3413,14 @@
             </w:tcMar>
           </w:tcPr>
           <w:p>
-            <w:r>
+            <w:pPr>
+              <w:spacing w:line="276" w:lineRule="auto"/>
+            </w:pPr>
+            <w:r>
+              <w:rPr>
+                <w:rFonts w:ascii="Calibri" w:hAnsi="Calibri"/>
+                <w:sz w:val="20"/>
+              </w:rPr>
               <w:t>Alternative B prototype package, comparative evaluation report (Alternative A vs B findings), technical documentation and handover.</w:t>
             </w:r>
           </w:p>
@@ -3316,7 +3464,14 @@
             </w:tcMar>
           </w:tcPr>
           <w:p>
-            <w:r>
+            <w:pPr>
+              <w:spacing w:line="276" w:lineRule="auto"/>
+            </w:pPr>
+            <w:r>
+              <w:rPr>
+                <w:rFonts w:ascii="Calibri" w:hAnsi="Calibri"/>
+                <w:sz w:val="20"/>
+              </w:rPr>
               <w:t>Total</w:t>
             </w:r>
           </w:p>
@@ -3340,8 +3495,15 @@
             <w:vAlign w:val="center"/>
           </w:tcPr>
           <w:p>
-            <w:r>
-              <w:t>Pooja: 30h | Jaiadithya: 30h | Balachandra: 20h</w:t>
+            <w:pPr>
+              <w:spacing w:line="276" w:lineRule="auto"/>
+            </w:pPr>
+            <w:r>
+              <w:rPr>
+                <w:rFonts w:ascii="Calibri" w:hAnsi="Calibri"/>
+                <w:sz w:val="20"/>
+              </w:rPr>
+              <w:t>Pooja: 80h | Jaiadithya: 80h | Balachandra: 80h</w:t>
             </w:r>
           </w:p>
         </w:tc>
@@ -3364,8 +3526,15 @@
             <w:vAlign w:val="center"/>
           </w:tcPr>
           <w:p>
-            <w:r>
-              <w:t>80</w:t>
+            <w:pPr>
+              <w:spacing w:line="276" w:lineRule="auto"/>
+            </w:pPr>
+            <w:r>
+              <w:rPr>
+                <w:rFonts w:ascii="Calibri" w:hAnsi="Calibri"/>
+                <w:sz w:val="20"/>
+              </w:rPr>
+              <w:t>240</w:t>
             </w:r>
           </w:p>
         </w:tc>
@@ -3387,8 +3556,15 @@
             </w:tcMar>
           </w:tcPr>
           <w:p>
-            <w:r>
-              <w:t>Completed 80-hour prototype evaluation</w:t>
+            <w:pPr>
+              <w:spacing w:line="276" w:lineRule="auto"/>
+            </w:pPr>
+            <w:r>
+              <w:rPr>
+                <w:rFonts w:ascii="Calibri" w:hAnsi="Calibri"/>
+                <w:sz w:val="20"/>
+              </w:rPr>
+              <w:t>Completed 240-hour prototype comparative evaluation</w:t>
             </w:r>
           </w:p>
         </w:tc>
@@ -3669,7 +3845,7 @@
           </w:tcPr>
           <w:p>
             <w:r>
-              <w:t>Internal engineering team — 80 person-hours across 3 members (¥0 chargeback)</w:t>
+              <w:t>Internal engineering team — 240 person-hours across 3 members (80h/person at ¥0 chargeback)</w:t>
             </w:r>
           </w:p>
         </w:tc>
@@ -4840,7 +5016,7 @@
           </w:tcPr>
           <w:p>
             <w:r>
-              <w:t>System architecture, ontology schema design, alternative comparison coordination, code reviews (30 h)</w:t>
+              <w:t>System architecture, ontology schema design, alternative comparison coordination, code reviews (80 h)</w:t>
             </w:r>
           </w:p>
         </w:tc>
@@ -4979,7 +5155,7 @@
           </w:tcPr>
           <w:p>
             <w:r>
-              <w:t>Core action runtime development, epistemic memory engine, API endpoints, integration (30 h)</w:t>
+              <w:t>Core action runtime development, epistemic memory engine, API endpoints, integration (80 h)</w:t>
             </w:r>
           </w:p>
         </w:tc>
@@ -5118,7 +5294,7 @@
           </w:tcPr>
           <w:p>
             <w:r>
-              <w:t>Benchmark test plan, test execution, tenant isolation checks, security validation, defect tracking (20 h)</w:t>
+              <w:t>Benchmark test plan, test execution, tenant isolation checks, security validation, defect tracking (80 h)</w:t>
             </w:r>
           </w:p>
         </w:tc>
@@ -5435,7 +5611,7 @@
           </w:tcPr>
           <w:p>
             <w:r>
-              <w:t>Development effort exceeds the 80 person-hour allocation</w:t>
+              <w:t>Development effort exceeds the 240 person-hour allocation (80h/person)</w:t>
             </w:r>
           </w:p>
         </w:tc>
@@ -5506,7 +5682,7 @@
           </w:tcPr>
           <w:p>
             <w:r>
-              <w:t>Strictly bound prototype to core action runtime and retrieval; defer GUI overhaul and SSO to future roadmap; track hours weekly by deliverable.</w:t>
+              <w:t>Strictly bound prototype to core action runtime and retrieval; defer GUI overhaul and SSO to future roadmap; track weekly hours against the 80h/person ceiling.</w:t>
             </w:r>
           </w:p>
         </w:tc>
@@ -6622,7 +6798,7 @@
                 <w:rFonts w:ascii="Calibri" w:hAnsi="Calibri"/>
                 <w:sz w:val="20"/>
               </w:rPr>
-              <w:t>Delivery completed within ≤ 80 person-hours and ≤ ¥27,500 direct expenditure</w:t>
+              <w:t>Delivery completed within ≤ 240 person-hours (80 hours per person) and ≤ ¥27,500 direct expenditure</w:t>
             </w:r>
           </w:p>
         </w:tc>

</xml_diff>